<commit_message>
Actualizacion de los documentos del trabajo
</commit_message>
<xml_diff>
--- a/Reto 2/Documento_Sustentacion_Reto2.docx
+++ b/Reto 2/Documento_Sustentacion_Reto2.docx
@@ -1265,45 +1265,7 @@
         <w:rPr>
           <w:sz w:val="18"/>
         </w:rPr>
-        <w:t>Cada integrante releyo el codigo por su c</w:t>
-      </w:r>
-      <w:r>
-        <w:rPr>
-          <w:sz w:val="18"/>
-        </w:rPr>
-        <w:t xml:space="preserve">uenta antes de consultar cualquier herramienta. P-02, P-03 y P-04 se identificaron asi, sin IA: son puntos que ya se habian notado leyendo </w:t>
-      </w:r>
-      <w:r>
-        <w:rPr>
-          <w:rFonts w:ascii="Consolas" w:hAnsi="Consolas"/>
-          <w:sz w:val="18"/>
-        </w:rPr>
-        <w:t>ServicioVenta</w:t>
-      </w:r>
-      <w:r>
-        <w:rPr>
-          <w:sz w:val="18"/>
-        </w:rPr>
-        <w:t xml:space="preserve">, </w:t>
-      </w:r>
-      <w:r>
-        <w:rPr>
-          <w:rFonts w:ascii="Consolas" w:hAnsi="Consolas"/>
-          <w:sz w:val="18"/>
-        </w:rPr>
-        <w:t>ServicioMonitoreoProductos</w:t>
-      </w:r>
-      <w:r>
-        <w:rPr>
-          <w:sz w:val="18"/>
-        </w:rPr>
-        <w:t xml:space="preserve"> y los tres cargadores TXT durante el Reto 1. P-01 y P-05 se consolidaron de</w:t>
-      </w:r>
-      <w:r>
-        <w:rPr>
-          <w:sz w:val="18"/>
-        </w:rPr>
-        <w:t>spues, en la discusion de grupo con apoyo de IA, para confirmar el costo exacto en archivos y clases.</w:t>
+        <w:t>Cada integrante releyo el codigo por su cuenta antes de consultar cualquier herramienta. P-02, P-03, P-04 y P-05 surgieron asi, sin IA: son puntos que ya se habian notado leyendo ServicioVenta, ServicioMonitoreoProductos, los tres cargadores TXT y el menu durante el Reto 1. P-01 (la busqueda de productos duplicada entre consultar y vender) se detecto con apoyo de una herramienta de IA y se comprobo contra el codigo citado.</w:t>
       </w:r>
     </w:p>
     <w:tbl>
@@ -1403,9 +1365,6 @@
           </w:tcPr>
           <w:p>
             <w:r>
-              <w:rPr>
-                <w:sz w:val="18"/>
-              </w:rPr>
               <w:t>P-01</w:t>
             </w:r>
           </w:p>
@@ -1416,10 +1375,7 @@
           </w:tcPr>
           <w:p>
             <w:r>
-              <w:rPr>
-                <w:sz w:val="18"/>
-              </w:rPr>
-              <w:t>El formato de productos esta acoplado al orden posicional de sus columnas</w:t>
+              <w:t>La busqueda de productos esta duplicada entre la consulta y la venta</w:t>
             </w:r>
           </w:p>
         </w:tc>
@@ -1429,16 +1385,7 @@
           </w:tcPr>
           <w:p>
             <w:r>
-              <w:rPr>
-                <w:sz w:val="18"/>
-              </w:rPr>
-              <w:t xml:space="preserve">3 archivos / 3 </w:t>
-            </w:r>
-            <w:r>
-              <w:rPr>
-                <w:sz w:val="18"/>
-              </w:rPr>
-              <w:t>clases</w:t>
+              <w:t>2 archivos / 2 clases</w:t>
             </w:r>
           </w:p>
         </w:tc>
@@ -1448,10 +1395,7 @@
           </w:tcPr>
           <w:p>
             <w:r>
-              <w:rPr>
-                <w:sz w:val="18"/>
-              </w:rPr>
-              <w:t>Alta</w:t>
+              <w:t>Media</w:t>
             </w:r>
           </w:p>
         </w:tc>
@@ -1461,10 +1405,7 @@
           </w:tcPr>
           <w:p>
             <w:r>
-              <w:rPr>
-                <w:sz w:val="18"/>
-              </w:rPr>
-              <w:t>Intervenir</w:t>
+              <w:t>Centralizar sin patron</w:t>
             </w:r>
           </w:p>
         </w:tc>
@@ -1804,13 +1745,7 @@
         <w:rPr>
           <w:sz w:val="18"/>
         </w:rPr>
-        <w:t>P-01 encapsula el parseo del inventario en el creador de cada tipo; P-02, P-03 y P-04 justifican respectivamente Strategy, Composite y Template Method como patrones nuevos. P-0</w:t>
-      </w:r>
-      <w:r>
-        <w:rPr>
-          <w:sz w:val="18"/>
-        </w:rPr>
-        <w:t>5 queda como deuda aceptada: demuestra que el equipo no adopta un patron cuando su costo supera el beneficio.</w:t>
+        <w:t>P-01 se resuelve con una operacion comun en ServicioProducto, sin anadir un patron; P-02, P-03 y P-04 justifican respectivamente Strategy, Composite y Template Method como patrones nuevos. P-05 queda como deuda aceptada: demuestra que el equipo no adopta un patron cuando su costo supera el beneficio.</w:t>
       </w:r>
     </w:p>
     <w:p>
@@ -1959,9 +1894,6 @@
           </w:tcPr>
           <w:p>
             <w:r>
-              <w:rPr>
-                <w:sz w:val="17"/>
-              </w:rPr>
               <w:t>Factory Method</w:t>
             </w:r>
           </w:p>
@@ -1972,9 +1904,6 @@
           </w:tcPr>
           <w:p>
             <w:r>
-              <w:rPr>
-                <w:sz w:val="17"/>
-              </w:rPr>
               <w:t>Creacional</w:t>
             </w:r>
           </w:p>
@@ -1985,9 +1914,6 @@
           </w:tcPr>
           <w:p>
             <w:r>
-              <w:rPr>
-                <w:sz w:val="17"/>
-              </w:rPr>
               <w:t>P-01</w:t>
             </w:r>
           </w:p>
@@ -1998,10 +1924,7 @@
           </w:tcPr>
           <w:p>
             <w:r>
-              <w:rPr>
-                <w:sz w:val="17"/>
-              </w:rPr>
-              <w:t>Mantener y consolidar</w:t>
+              <w:t>Descartado</w:t>
             </w:r>
           </w:p>
         </w:tc>
@@ -2011,10 +1934,7 @@
           </w:tcPr>
           <w:p>
             <w:r>
-              <w:rPr>
-                <w:sz w:val="17"/>
-              </w:rPr>
-              <w:t>Sera el unico mecanismo de creacion; ya existe en el AS-IS.</w:t>
+              <w:t>No elimina la busqueda duplicada; el patron ya existe para crear productos y se conserva como parte del AS-IS, pero no atiende P-01.</w:t>
             </w:r>
           </w:p>
         </w:tc>
@@ -2532,13 +2452,7 @@
         <w:rPr>
           <w:sz w:val="17"/>
         </w:rPr>
-        <w:t>Los patrones nuevos seran Strategy, Composite y Template Method</w:t>
-      </w:r>
-      <w:r>
-        <w:rPr>
-          <w:sz w:val="17"/>
-        </w:rPr>
-        <w:t>. Factory Method se consolidara y Observer seguira como parte del AS-IS, sin contarlos como incorporaciones del Reto 2. Facade y Command quedan descartados porque agregan mas estructura de la que el proyecto necesita.</w:t>
+        <w:t>Los patrones nuevos seran Strategy, Composite y Template Method. Factory Method permanece como parte del AS-IS, igual que Observer, sin contarlos como incorporaciones del Reto 2. Facade y Command quedan descartados porque agregan mas estructura de la que el proyecto necesita.</w:t>
       </w:r>
     </w:p>
     <w:p>
@@ -2660,9 +2574,6 @@
           </w:tcPr>
           <w:p>
             <w:r>
-              <w:rPr>
-                <w:sz w:val="15"/>
-              </w:rPr>
               <w:t>B-01</w:t>
             </w:r>
           </w:p>
@@ -2673,10 +2584,7 @@
           </w:tcPr>
           <w:p>
             <w:r>
-              <w:rPr>
-                <w:sz w:val="15"/>
-              </w:rPr>
-              <w:t>Cual solicitud de cambio convenia implementar</w:t>
+              <w:t>Que solicitud de cambio convenia implementar</w:t>
             </w:r>
           </w:p>
         </w:tc>
@@ -2686,9 +2594,6 @@
           </w:tcPr>
           <w:p>
             <w:r>
-              <w:rPr>
-                <w:sz w:val="15"/>
-              </w:rPr>
               <w:t>Trabajar con SC-3 porque introduce distintas reglas comerciales</w:t>
             </w:r>
           </w:p>
@@ -2699,9 +2604,6 @@
           </w:tcPr>
           <w:p>
             <w:r>
-              <w:rPr>
-                <w:sz w:val="15"/>
-              </w:rPr>
               <w:t>Aceptamos</w:t>
             </w:r>
           </w:p>
@@ -2712,23 +2614,7 @@
           </w:tcPr>
           <w:p>
             <w:r>
-              <w:rPr>
-                <w:sz w:val="15"/>
-              </w:rPr>
-              <w:t xml:space="preserve">SC-3 encaja con P-02. El contrato de </w:t>
-            </w:r>
-            <w:r>
-              <w:rPr>
-                <w:rFonts w:ascii="Consolas" w:hAnsi="Consolas"/>
-                <w:sz w:val="15"/>
-              </w:rPr>
-              <w:t>IDescuento.cs:9-12</w:t>
-            </w:r>
-            <w:r>
-              <w:rPr>
-                <w:sz w:val="15"/>
-              </w:rPr>
-              <w:t xml:space="preserve"> solo recibe un precio y no permite tener en cuenta al cliente, su convenio o el credito.</w:t>
+              <w:t>SC-3 se relaciona con P-02. IDescuento.cs:9-12 solo recibe un precio y no permite evaluar al cliente, su convenio ni el credito.</w:t>
             </w:r>
           </w:p>
         </w:tc>
@@ -2740,10 +2626,7 @@
           </w:tcPr>
           <w:p>
             <w:r>
-              <w:rPr>
-                <w:sz w:val="15"/>
-              </w:rPr>
-              <w:t>B-03</w:t>
+              <w:t>B-02</w:t>
             </w:r>
           </w:p>
         </w:tc>
@@ -2753,10 +2636,7 @@
           </w:tcPr>
           <w:p>
             <w:r>
-              <w:rPr>
-                <w:sz w:val="15"/>
-              </w:rPr>
-              <w:t>Como manejar las distintas politicas de convenio</w:t>
+              <w:t>Donde habia una rigidez concreta que no repitiera un hallazgo del Reto 1</w:t>
             </w:r>
           </w:p>
         </w:tc>
@@ -2766,10 +2646,7 @@
           </w:tcPr>
           <w:p>
             <w:r>
-              <w:rPr>
-                <w:sz w:val="15"/>
-              </w:rPr>
-              <w:t>Aplicar Strategy</w:t>
+              <w:t>Centralizar la busqueda de productos que esta duplicada en la consulta y la venta, sin anadir un patron</w:t>
             </w:r>
           </w:p>
         </w:tc>
@@ -2779,9 +2656,6 @@
           </w:tcPr>
           <w:p>
             <w:r>
-              <w:rPr>
-                <w:sz w:val="15"/>
-              </w:rPr>
               <w:t>Aceptamos</w:t>
             </w:r>
           </w:p>
@@ -2792,29 +2666,7 @@
           </w:tcPr>
           <w:p>
             <w:r>
-              <w:rPr>
-                <w:sz w:val="15"/>
-              </w:rPr>
-              <w:t>La politica debe elegirse dur</w:t>
-            </w:r>
-            <w:r>
-              <w:rPr>
-                <w:sz w:val="15"/>
-              </w:rPr>
-              <w:t xml:space="preserve">ante la venta sin agregar condicionales por convenio en el flujo principal. Cada regla quedara detras de </w:t>
-            </w:r>
-            <w:r>
-              <w:rPr>
-                <w:rFonts w:ascii="Consolas" w:hAnsi="Consolas"/>
-                <w:sz w:val="15"/>
-              </w:rPr>
-              <w:t>IPoliticaConvenio</w:t>
-            </w:r>
-            <w:r>
-              <w:rPr>
-                <w:sz w:val="15"/>
-              </w:rPr>
-              <w:t>.</w:t>
+              <w:t>Program.cs:273-278 y ServicioVenta.cs:24-32 aplican el mismo criterio. P-01 quedo como hallazgo asistido por IA. ServicioProducto tendra la busqueda comun; cambiar el criterio pasara de 2 archivos / 2 clases a 1 archivo / 1 clase.</w:t>
             </w:r>
           </w:p>
         </w:tc>
@@ -2826,10 +2678,7 @@
           </w:tcPr>
           <w:p>
             <w:r>
-              <w:rPr>
-                <w:sz w:val="15"/>
-              </w:rPr>
-              <w:t>B-04</w:t>
+              <w:t>B-03</w:t>
             </w:r>
           </w:p>
         </w:tc>
@@ -2839,10 +2688,7 @@
           </w:tcPr>
           <w:p>
             <w:r>
-              <w:rPr>
-                <w:sz w:val="15"/>
-              </w:rPr>
-              <w:t>Si debiamos crear una estrategia para cada tipo de entidad</w:t>
+              <w:t>Como manejar las modalidades de convenio</w:t>
             </w:r>
           </w:p>
         </w:tc>
@@ -2852,16 +2698,7 @@
           </w:tcPr>
           <w:p>
             <w:r>
-              <w:rPr>
-                <w:sz w:val="15"/>
-              </w:rPr>
-              <w:t xml:space="preserve">Crear estrategias para empresas, bancos, cooperativas, </w:t>
-            </w:r>
-            <w:r>
-              <w:rPr>
-                <w:sz w:val="15"/>
-              </w:rPr>
-              <w:t>universidades y colegios</w:t>
+              <w:t>Aplicar Strategy y crear un contrato para la evaluacion comercial</w:t>
             </w:r>
           </w:p>
         </w:tc>
@@ -2871,10 +2708,7 @@
           </w:tcPr>
           <w:p>
             <w:r>
-              <w:rPr>
-                <w:sz w:val="15"/>
-              </w:rPr>
-              <w:t>Corregimos</w:t>
+              <w:t>Aceptamos</w:t>
             </w:r>
           </w:p>
         </w:tc>
@@ -2884,10 +2718,7 @@
           </w:tcPr>
           <w:p>
             <w:r>
-              <w:rPr>
-                <w:sz w:val="15"/>
-              </w:rPr>
-              <w:t>La entidad sera un dato. Solo habra estrategias diferentes cuando cambie el calculo: descuento, credito o ambos. Asi evitamos cinco clases con comportamiento casi identico.</w:t>
+              <w:t>La politica debe elegirse durante la venta sin agregar ramas por modalidad al flujo principal. ServicioVentaConvenio dependera de IPoliticaConvenio; la venta normal no cambia.</w:t>
             </w:r>
           </w:p>
         </w:tc>
@@ -2899,10 +2730,7 @@
           </w:tcPr>
           <w:p>
             <w:r>
-              <w:rPr>
-                <w:sz w:val="15"/>
-              </w:rPr>
-              <w:t>B-05</w:t>
+              <w:t>B-04</w:t>
             </w:r>
           </w:p>
         </w:tc>
@@ -2912,16 +2740,7 @@
           </w:tcPr>
           <w:p>
             <w:r>
-              <w:rPr>
-                <w:sz w:val="15"/>
-              </w:rPr>
-              <w:t>Si Strategy necesitaba una Facade adicion</w:t>
-            </w:r>
-            <w:r>
-              <w:rPr>
-                <w:sz w:val="15"/>
-              </w:rPr>
-              <w:t>al</w:t>
+              <w:t>Si debiamos crear una estrategia para cada entidad</w:t>
             </w:r>
           </w:p>
         </w:tc>
@@ -2931,23 +2750,7 @@
           </w:tcPr>
           <w:p>
             <w:r>
-              <w:rPr>
-                <w:sz w:val="15"/>
-              </w:rPr>
-              <w:t xml:space="preserve">Crear </w:t>
-            </w:r>
-            <w:r>
-              <w:rPr>
-                <w:rFonts w:ascii="Consolas" w:hAnsi="Consolas"/>
-                <w:sz w:val="15"/>
-              </w:rPr>
-              <w:t>ServicioConvenios</w:t>
-            </w:r>
-            <w:r>
-              <w:rPr>
-                <w:sz w:val="15"/>
-              </w:rPr>
-              <w:t xml:space="preserve"> para coordinar las estrategias</w:t>
+              <w:t>Crear estrategias para empresas, bancos, cooperativas, universidades y colegios</w:t>
             </w:r>
           </w:p>
         </w:tc>
@@ -2957,10 +2760,7 @@
           </w:tcPr>
           <w:p>
             <w:r>
-              <w:rPr>
-                <w:sz w:val="15"/>
-              </w:rPr>
-              <w:t>Rechazamos</w:t>
+              <w:t>Corregimos</w:t>
             </w:r>
           </w:p>
         </w:tc>
@@ -2970,17 +2770,7 @@
           </w:tcPr>
           <w:p>
             <w:r>
-              <w:rPr>
-                <w:rFonts w:ascii="Consolas" w:hAnsi="Consolas"/>
-                <w:sz w:val="15"/>
-              </w:rPr>
-              <w:t>ServicioVentaConvenio</w:t>
-            </w:r>
-            <w:r>
-              <w:rPr>
-                <w:sz w:val="15"/>
-              </w:rPr>
-              <w:t xml:space="preserve"> puede seleccionar la estrategia directamente. La Facade agregaria dos clases y otra construccion sin ocultar un subsistema que hoy sea complejo.</w:t>
+              <w:t>La entidad sera un dato de Convenio. Las estrategias solo cambian cuando cambia el calculo: descuento, credito o ambos. Asi se evitan cinco clases con comportamiento repetido.</w:t>
             </w:r>
           </w:p>
         </w:tc>
@@ -2992,10 +2782,7 @@
           </w:tcPr>
           <w:p>
             <w:r>
-              <w:rPr>
-                <w:sz w:val="15"/>
-              </w:rPr>
-              <w:t>B-06</w:t>
+              <w:t>B-05</w:t>
             </w:r>
           </w:p>
         </w:tc>
@@ -3005,23 +2792,7 @@
           </w:tcPr>
           <w:p>
             <w:r>
-              <w:rPr>
-                <w:sz w:val="15"/>
-              </w:rPr>
-              <w:t>Si Facade podi</w:t>
-            </w:r>
-            <w:r>
-              <w:rPr>
-                <w:sz w:val="15"/>
-              </w:rPr>
-              <w:t xml:space="preserve">a resolver la concentracion de </w:t>
-            </w:r>
-            <w:r>
-              <w:rPr>
-                <w:rFonts w:ascii="Consolas" w:hAnsi="Consolas"/>
-                <w:sz w:val="15"/>
-              </w:rPr>
-              <w:t>Program</w:t>
+              <w:t>Si Strategy necesitaba una Facade adicional</w:t>
             </w:r>
           </w:p>
         </w:tc>
@@ -3031,10 +2802,7 @@
           </w:tcPr>
           <w:p>
             <w:r>
-              <w:rPr>
-                <w:sz w:val="15"/>
-              </w:rPr>
-              <w:t>Usarla para reducir el ensamblaje del sistema</w:t>
+              <w:t>Crear ServicioConvenios para coordinar las estrategias</w:t>
             </w:r>
           </w:p>
         </w:tc>
@@ -3044,9 +2812,6 @@
           </w:tcPr>
           <w:p>
             <w:r>
-              <w:rPr>
-                <w:sz w:val="15"/>
-              </w:rPr>
               <w:t>Rechazamos</w:t>
             </w:r>
           </w:p>
@@ -3057,42 +2822,7 @@
           </w:tcPr>
           <w:p>
             <w:r>
-              <w:rPr>
-                <w:sz w:val="15"/>
-              </w:rPr>
-              <w:t xml:space="preserve">La Facade no elimina ninguno de los objetos ni las suscripciones actuales de </w:t>
-            </w:r>
-            <w:r>
-              <w:rPr>
-                <w:rFonts w:ascii="Consolas" w:hAnsi="Consolas"/>
-                <w:sz w:val="15"/>
-              </w:rPr>
-              <w:t>Program.cs:8-110</w:t>
-            </w:r>
-            <w:r>
-              <w:rPr>
-                <w:sz w:val="15"/>
-              </w:rPr>
-              <w:t xml:space="preserve">; solo moveria u ocultaria ese codigo. </w:t>
-            </w:r>
-            <w:r>
-              <w:rPr>
-                <w:rFonts w:ascii="Consolas" w:hAnsi="Consolas"/>
-                <w:sz w:val="15"/>
-              </w:rPr>
-              <w:t>Program</w:t>
-            </w:r>
-            <w:r>
-              <w:rPr>
-                <w:sz w:val="15"/>
-              </w:rPr>
-              <w:t xml:space="preserve"> debe seguir siendo e</w:t>
-            </w:r>
-            <w:r>
-              <w:rPr>
-                <w:sz w:val="15"/>
-              </w:rPr>
-              <w:t>l Composition Root.</w:t>
+              <w:t>ServicioVentaConvenio ya coordina el caso de uso. La Facade anadiria otra clase sin ocultar un subsistema complejo ni reducir dependencias reales.</w:t>
             </w:r>
           </w:p>
         </w:tc>
@@ -3104,10 +2834,7 @@
           </w:tcPr>
           <w:p>
             <w:r>
-              <w:rPr>
-                <w:sz w:val="15"/>
-              </w:rPr>
-              <w:t>B-07</w:t>
+              <w:t>B-06</w:t>
             </w:r>
           </w:p>
         </w:tc>
@@ -3117,10 +2844,7 @@
           </w:tcPr>
           <w:p>
             <w:r>
-              <w:rPr>
-                <w:sz w:val="15"/>
-              </w:rPr>
-              <w:t>Que patron servia para agregar nuevas alertas</w:t>
+              <w:t>Si Facade podia resolver la concentracion de Program</w:t>
             </w:r>
           </w:p>
         </w:tc>
@@ -3130,10 +2854,7 @@
           </w:tcPr>
           <w:p>
             <w:r>
-              <w:rPr>
-                <w:sz w:val="15"/>
-              </w:rPr>
-              <w:t>Usar Chain of Responsibility</w:t>
+              <w:t>Mover el ensamblaje detras de una fachada</w:t>
             </w:r>
           </w:p>
         </w:tc>
@@ -3143,10 +2864,7 @@
           </w:tcPr>
           <w:p>
             <w:r>
-              <w:rPr>
-                <w:sz w:val="15"/>
-              </w:rPr>
-              <w:t>Corregimos</w:t>
+              <w:t>Rechazamos</w:t>
             </w:r>
           </w:p>
         </w:tc>
@@ -3156,16 +2874,7 @@
           </w:tcPr>
           <w:p>
             <w:r>
-              <w:rPr>
-                <w:sz w:val="15"/>
-              </w:rPr>
-              <w:t>Las comprobaciones de stock y vencimiento deben ejecutarse siempre. Composite representa mejor un grupo de reglas que se recorren completas, com</w:t>
-            </w:r>
-            <w:r>
-              <w:rPr>
-                <w:sz w:val="15"/>
-              </w:rPr>
-              <w:t>o exige P-03.</w:t>
+              <w:t>La Facade solo ocultaria las construcciones y suscripciones de Program.cs:8-110. Program debe seguir siendo el Composition Root.</w:t>
             </w:r>
           </w:p>
         </w:tc>
@@ -3177,11 +2886,7 @@
           </w:tcPr>
           <w:p>
             <w:r>
-              <w:rPr>
-                <w:sz w:val="15"/>
-              </w:rPr>
-              <w:lastRenderedPageBreak/>
-              <w:t>B-08</w:t>
+              <w:t>B-07</w:t>
             </w:r>
           </w:p>
         </w:tc>
@@ -3191,10 +2896,7 @@
           </w:tcPr>
           <w:p>
             <w:r>
-              <w:rPr>
-                <w:sz w:val="15"/>
-              </w:rPr>
-              <w:t>Como evitar la repeticion en los tres cargadores TXT</w:t>
+              <w:t>Que patron servia para agregar alertas</w:t>
             </w:r>
           </w:p>
         </w:tc>
@@ -3204,10 +2906,7 @@
           </w:tcPr>
           <w:p>
             <w:r>
-              <w:rPr>
-                <w:sz w:val="15"/>
-              </w:rPr>
-              <w:t>Aplicar Template Method</w:t>
+              <w:t>Usar Chain of Responsibility</w:t>
             </w:r>
           </w:p>
         </w:tc>
@@ -3217,10 +2916,7 @@
           </w:tcPr>
           <w:p>
             <w:r>
-              <w:rPr>
-                <w:sz w:val="15"/>
-              </w:rPr>
-              <w:t>Aceptamos</w:t>
+              <w:t>Corregimos</w:t>
             </w:r>
           </w:p>
         </w:tc>
@@ -3230,43 +2926,7 @@
           </w:tcPr>
           <w:p>
             <w:r>
-              <w:rPr>
-                <w:rFonts w:ascii="Consolas" w:hAnsi="Consolas"/>
-                <w:sz w:val="15"/>
-              </w:rPr>
-              <w:t>CargadorProductosTxt.cs:22-63</w:t>
-            </w:r>
-            <w:r>
-              <w:rPr>
-                <w:sz w:val="15"/>
-              </w:rPr>
-              <w:t xml:space="preserve">, </w:t>
-            </w:r>
-            <w:r>
-              <w:rPr>
-                <w:rFonts w:ascii="Consolas" w:hAnsi="Consolas"/>
-                <w:sz w:val="15"/>
-              </w:rPr>
-              <w:t>CargadorClientesTxt.cs:13-43</w:t>
-            </w:r>
-            <w:r>
-              <w:rPr>
-                <w:sz w:val="15"/>
-              </w:rPr>
-              <w:t xml:space="preserve"> y </w:t>
-            </w:r>
-            <w:r>
-              <w:rPr>
-                <w:rFonts w:ascii="Consolas" w:hAnsi="Consolas"/>
-                <w:sz w:val="15"/>
-              </w:rPr>
-              <w:t>CargadorUsuariosTxt.cs:13-45</w:t>
-            </w:r>
-            <w:r>
-              <w:rPr>
-                <w:sz w:val="15"/>
-              </w:rPr>
-              <w:t xml:space="preserve"> repiten el mismo flujo y solo cambia la conversion de cada linea.</w:t>
+              <w:t>Stock y vencimiento deben comprobarse siempre. Composite permite tratar las hojas y el grupo mediante IReglaAlerta y ejecutar la coleccion completa.</w:t>
             </w:r>
           </w:p>
         </w:tc>
@@ -3278,10 +2938,7 @@
           </w:tcPr>
           <w:p>
             <w:r>
-              <w:rPr>
-                <w:sz w:val="15"/>
-              </w:rPr>
-              <w:t>B-09</w:t>
+              <w:t>B-08</w:t>
             </w:r>
           </w:p>
         </w:tc>
@@ -3291,10 +2948,7 @@
           </w:tcPr>
           <w:p>
             <w:r>
-              <w:rPr>
-                <w:sz w:val="15"/>
-              </w:rPr>
-              <w:t>Si convenia separar cada opcion del menu en un comando</w:t>
+              <w:t>Como eliminar la repeticion de los cargadores TXT</w:t>
             </w:r>
           </w:p>
         </w:tc>
@@ -3304,10 +2958,7 @@
           </w:tcPr>
           <w:p>
             <w:r>
-              <w:rPr>
-                <w:sz w:val="15"/>
-              </w:rPr>
-              <w:t>Aplicar Command</w:t>
+              <w:t>Aplicar Template Method</w:t>
             </w:r>
           </w:p>
         </w:tc>
@@ -3317,10 +2968,7 @@
           </w:tcPr>
           <w:p>
             <w:r>
-              <w:rPr>
-                <w:sz w:val="15"/>
-              </w:rPr>
-              <w:t>Rechazamos</w:t>
+              <w:t>Aceptamos</w:t>
             </w:r>
           </w:p>
         </w:tc>
@@ -3330,29 +2978,7 @@
           </w:tcPr>
           <w:p>
             <w:r>
-              <w:rPr>
-                <w:sz w:val="15"/>
-              </w:rPr>
-              <w:t xml:space="preserve">P-05 cuesta hoy un archivo. Command exigiria una interfaz, siete comandos y cambios en </w:t>
-            </w:r>
-            <w:r>
-              <w:rPr>
-                <w:rFonts w:ascii="Consolas" w:hAnsi="Consolas"/>
-                <w:sz w:val="15"/>
-              </w:rPr>
-              <w:t>Program</w:t>
-            </w:r>
-            <w:r>
-              <w:rPr>
-                <w:sz w:val="15"/>
-              </w:rPr>
-              <w:t>, sin q</w:t>
-            </w:r>
-            <w:r>
-              <w:rPr>
-                <w:sz w:val="15"/>
-              </w:rPr>
-              <w:t>ue existan historial, deshacer u otra interfaz que reutilice esos comandos.</w:t>
+              <w:t>CargadorProductosTxt.cs:22-63, CargadorClientesTxt.cs:13-43 y CargadorUsuariosTxt.cs:13-45 repiten el flujo. CargadorTxt&lt;T&gt; lo concentrara y cada cargador implementara ParsearCampos.</w:t>
             </w:r>
           </w:p>
         </w:tc>
@@ -3364,10 +2990,7 @@
           </w:tcPr>
           <w:p>
             <w:r>
-              <w:rPr>
-                <w:sz w:val="15"/>
-              </w:rPr>
-              <w:t>B-10</w:t>
+              <w:t>B-09</w:t>
             </w:r>
           </w:p>
         </w:tc>
@@ -3377,10 +3000,7 @@
           </w:tcPr>
           <w:p>
             <w:r>
-              <w:rPr>
-                <w:sz w:val="15"/>
-              </w:rPr>
-              <w:t>Si la variacion de convenios justificaba una Abstract Factory</w:t>
+              <w:t>Si convenia separar cada opcion del menu en un comando</w:t>
             </w:r>
           </w:p>
         </w:tc>
@@ -3390,10 +3010,7 @@
           </w:tcPr>
           <w:p>
             <w:r>
-              <w:rPr>
-                <w:sz w:val="15"/>
-              </w:rPr>
-              <w:t>Crear una fabrica abstracta por familia de convenios</w:t>
+              <w:t>Aplicar Command</w:t>
             </w:r>
           </w:p>
         </w:tc>
@@ -3403,9 +3020,6 @@
           </w:tcPr>
           <w:p>
             <w:r>
-              <w:rPr>
-                <w:sz w:val="15"/>
-              </w:rPr>
               <w:t>Rechazamos</w:t>
             </w:r>
           </w:p>
@@ -3416,16 +3030,7 @@
           </w:tcPr>
           <w:p>
             <w:r>
-              <w:rPr>
-                <w:sz w:val="15"/>
-              </w:rPr>
-              <w:t xml:space="preserve">No hay una familia real de objetos que crear de </w:t>
-            </w:r>
-            <w:r>
-              <w:rPr>
-                <w:sz w:val="15"/>
-              </w:rPr>
-              <w:t>forma coordinada: cada convenio solo cambia el calculo de descuento/credito, no un conjunto de productos relacionados. Una familia irreal agregaria interfaces y fabricas innecesarias, como se registro en el analisis SC-3.</w:t>
+              <w:t>P-05 cuesta hoy 1 archivo / 1 clase implicita. Command exigiria una interfaz, siete comandos y cambios en Program, sin historial, deshacer ni otro cliente del menu.</w:t>
             </w:r>
           </w:p>
         </w:tc>
@@ -3437,10 +3042,7 @@
           </w:tcPr>
           <w:p>
             <w:r>
-              <w:rPr>
-                <w:sz w:val="15"/>
-              </w:rPr>
-              <w:t>B-11</w:t>
+              <w:t>B-10</w:t>
             </w:r>
           </w:p>
         </w:tc>
@@ -3450,16 +3052,7 @@
           </w:tcPr>
           <w:p>
             <w:r>
-              <w:rPr>
-                <w:sz w:val="15"/>
-              </w:rPr>
-              <w:t xml:space="preserve">Si el Observer existente de </w:t>
-            </w:r>
-            <w:r>
-              <w:rPr>
-                <w:sz w:val="15"/>
-              </w:rPr>
-              <w:t>las alertas debia tratarse como patron nuevo del Reto 2</w:t>
+              <w:t>Si los convenios justificaban Abstract Factory</w:t>
             </w:r>
           </w:p>
         </w:tc>
@@ -3469,10 +3062,7 @@
           </w:tcPr>
           <w:p>
             <w:r>
-              <w:rPr>
-                <w:sz w:val="15"/>
-              </w:rPr>
-              <w:t>Contarlo como incorporacion junto a Strategy, Composite y Template Method</w:t>
+              <w:t>Crear una fabrica por familia de convenios</w:t>
             </w:r>
           </w:p>
         </w:tc>
@@ -3482,10 +3072,7 @@
           </w:tcPr>
           <w:p>
             <w:r>
-              <w:rPr>
-                <w:sz w:val="15"/>
-              </w:rPr>
-              <w:t>Corregimos</w:t>
+              <w:t>Rechazamos</w:t>
             </w:r>
           </w:p>
         </w:tc>
@@ -3495,16 +3082,7 @@
           </w:tcPr>
           <w:p>
             <w:r>
-              <w:rPr>
-                <w:sz w:val="15"/>
-              </w:rPr>
-              <w:t>Observer ya esta en el AS-IS publicando las alertas de stock y vencimiento, y Composite lo conserva para publicar l</w:t>
-            </w:r>
-            <w:r>
-              <w:rPr>
-                <w:sz w:val="15"/>
-              </w:rPr>
-              <w:t>os mensajes. No es una incorporacion del Reto 2; se mantiene como parte de la base y no se suma a la cuenta de patrones adoptados.</w:t>
+              <w:t>No hay familias de objetos que deban crearse juntas. La variacion esta en el calculo comercial, por lo que Abstract Factory agregaria fabricas e interfaces sin resolver P-02.</w:t>
             </w:r>
           </w:p>
         </w:tc>
@@ -3516,10 +3094,7 @@
           </w:tcPr>
           <w:p>
             <w:r>
-              <w:rPr>
-                <w:sz w:val="15"/>
-              </w:rPr>
-              <w:t>B-12</w:t>
+              <w:t>B-11</w:t>
             </w:r>
           </w:p>
         </w:tc>
@@ -3529,23 +3104,7 @@
           </w:tcPr>
           <w:p>
             <w:r>
-              <w:rPr>
-                <w:sz w:val="15"/>
-              </w:rPr>
-              <w:t xml:space="preserve">Si </w:t>
-            </w:r>
-            <w:r>
-              <w:rPr>
-                <w:rFonts w:ascii="Consolas" w:hAnsi="Consolas"/>
-                <w:sz w:val="15"/>
-              </w:rPr>
-              <w:t>IReglaAlerta</w:t>
-            </w:r>
-            <w:r>
-              <w:rPr>
-                <w:sz w:val="15"/>
-              </w:rPr>
-              <w:t xml:space="preserve"> debia usar la firma exacta de los metodos actuales del monitor</w:t>
+              <w:t>Si el Observer actual debia contarse como patron nuevo</w:t>
             </w:r>
           </w:p>
         </w:tc>
@@ -3555,23 +3114,7 @@
           </w:tcPr>
           <w:p>
             <w:r>
-              <w:rPr>
-                <w:sz w:val="15"/>
-              </w:rPr>
-              <w:t xml:space="preserve">Una revision externa senialo que </w:t>
-            </w:r>
-            <w:r>
-              <w:rPr>
-                <w:rFonts w:ascii="Consolas" w:hAnsi="Consolas"/>
-                <w:sz w:val="15"/>
-              </w:rPr>
-              <w:t>Evaluar(producto)</w:t>
-            </w:r>
-            <w:r>
-              <w:rPr>
-                <w:sz w:val="15"/>
-              </w:rPr>
-              <w:t xml:space="preserve"> invertiria el recorrido y cambiaria el orden de las alertas</w:t>
+              <w:t>Sumarlo a Strategy, Composite y Template Method</w:t>
             </w:r>
           </w:p>
         </w:tc>
@@ -3581,9 +3124,6 @@
           </w:tcPr>
           <w:p>
             <w:r>
-              <w:rPr>
-                <w:sz w:val="15"/>
-              </w:rPr>
               <w:t>Corregimos</w:t>
             </w:r>
           </w:p>
@@ -3594,76 +3134,7 @@
           </w:tcPr>
           <w:p>
             <w:r>
-              <w:rPr>
-                <w:rFonts w:ascii="Consolas" w:hAnsi="Consolas"/>
-                <w:sz w:val="15"/>
-              </w:rPr>
-              <w:t>Program.cs:182-185</w:t>
-            </w:r>
-            <w:r>
-              <w:rPr>
-                <w:sz w:val="15"/>
-              </w:rPr>
-              <w:t xml:space="preserve"> llama </w:t>
-            </w:r>
-            <w:r>
-              <w:rPr>
-                <w:rFonts w:ascii="Consolas" w:hAnsi="Consolas"/>
-                <w:sz w:val="15"/>
-              </w:rPr>
-              <w:t>VerificarStock(productos)</w:t>
-            </w:r>
-            <w:r>
-              <w:rPr>
-                <w:sz w:val="15"/>
-              </w:rPr>
-              <w:t xml:space="preserve"> y despues </w:t>
-            </w:r>
-            <w:r>
-              <w:rPr>
-                <w:rFonts w:ascii="Consolas" w:hAnsi="Consolas"/>
-                <w:sz w:val="15"/>
-              </w:rPr>
-              <w:t>VerificarVencimiento(productos)</w:t>
-            </w:r>
-            <w:r>
-              <w:rPr>
-                <w:sz w:val="15"/>
-              </w:rPr>
-              <w:t xml:space="preserve"> por lotes completos. </w:t>
-            </w:r>
-            <w:r>
-              <w:rPr>
-                <w:rFonts w:ascii="Consolas" w:hAnsi="Consolas"/>
-                <w:sz w:val="15"/>
-              </w:rPr>
-              <w:t>Verificar(IEnumerabl</w:t>
-            </w:r>
-            <w:r>
-              <w:rPr>
-                <w:rFonts w:ascii="Consolas" w:hAnsi="Consolas"/>
-                <w:sz w:val="15"/>
-              </w:rPr>
-              <w:t>e&lt;Producto&gt;)</w:t>
-            </w:r>
-            <w:r>
-              <w:rPr>
-                <w:sz w:val="15"/>
-              </w:rPr>
-              <w:t xml:space="preserve"> conserva ese orden exacto; </w:t>
-            </w:r>
-            <w:r>
-              <w:rPr>
-                <w:rFonts w:ascii="Consolas" w:hAnsi="Consolas"/>
-                <w:sz w:val="15"/>
-              </w:rPr>
-              <w:t>Evaluar(producto)</w:t>
-            </w:r>
-            <w:r>
-              <w:rPr>
-                <w:sz w:val="15"/>
-              </w:rPr>
-              <w:t xml:space="preserve"> habria intercalado las alertas por producto y roto los 12 casos de caracterizacion.</w:t>
+              <w:t>Observer ya existe en el AS-IS y seguira publicando las alertas. No es una incorporacion del Reto 2 y no se suma al total de patrones adoptados.</w:t>
             </w:r>
           </w:p>
         </w:tc>
@@ -3675,10 +3146,7 @@
           </w:tcPr>
           <w:p>
             <w:r>
-              <w:rPr>
-                <w:sz w:val="15"/>
-              </w:rPr>
-              <w:t>B-13</w:t>
+              <w:t>B-12</w:t>
             </w:r>
           </w:p>
         </w:tc>
@@ -3688,23 +3156,7 @@
           </w:tcPr>
           <w:p>
             <w:r>
-              <w:rPr>
-                <w:sz w:val="15"/>
-              </w:rPr>
-              <w:t xml:space="preserve">Si </w:t>
-            </w:r>
-            <w:r>
-              <w:rPr>
-                <w:rFonts w:ascii="Consolas" w:hAnsi="Consolas"/>
-                <w:sz w:val="15"/>
-              </w:rPr>
-              <w:t>ServicioMonitoreoProductos</w:t>
-            </w:r>
-            <w:r>
-              <w:rPr>
-                <w:sz w:val="15"/>
-              </w:rPr>
-              <w:t xml:space="preserve"> debia quedar como coordinador que delega en el compuesto, o salir por completo</w:t>
+              <w:t>Que datos necesitaban las politicas y quien debia modificar el estado</w:t>
             </w:r>
           </w:p>
         </w:tc>
@@ -3714,10 +3166,7 @@
           </w:tcPr>
           <w:p>
             <w:r>
-              <w:rPr>
-                <w:sz w:val="15"/>
-              </w:rPr>
-              <w:t>Una revision externa senialo que debia salir por completo, no solo transformarse</w:t>
+              <w:t>Incluir cliente, producto, cantidad y una clasificacion de entidad en la solicitud; permitir que la evaluacion manejara el resultado completo</w:t>
             </w:r>
           </w:p>
         </w:tc>
@@ -3727,10 +3176,7 @@
           </w:tcPr>
           <w:p>
             <w:r>
-              <w:rPr>
-                <w:sz w:val="15"/>
-              </w:rPr>
-              <w:t>Aceptamos</w:t>
+              <w:t>Corregimos</w:t>
             </w:r>
           </w:p>
         </w:tc>
@@ -3740,193 +3186,7 @@
           </w:tcPr>
           <w:p>
             <w:r>
-              <w:rPr>
-                <w:sz w:val="15"/>
-              </w:rPr>
-              <w:t xml:space="preserve">Con </w:t>
-            </w:r>
-            <w:r>
-              <w:rPr>
-                <w:rFonts w:ascii="Consolas" w:hAnsi="Consolas"/>
-                <w:sz w:val="15"/>
-              </w:rPr>
-              <w:t>MonitorCompuesto</w:t>
-            </w:r>
-            <w:r>
-              <w:rPr>
-                <w:sz w:val="15"/>
-              </w:rPr>
-              <w:t xml:space="preserve"> implementando </w:t>
-            </w:r>
-            <w:r>
-              <w:rPr>
-                <w:rFonts w:ascii="Consolas" w:hAnsi="Consolas"/>
-                <w:sz w:val="15"/>
-              </w:rPr>
-              <w:t>IReglaAlerta</w:t>
-            </w:r>
-            <w:r>
-              <w:rPr>
-                <w:sz w:val="15"/>
-              </w:rPr>
-              <w:t xml:space="preserve">, </w:t>
-            </w:r>
-            <w:r>
-              <w:rPr>
-                <w:rFonts w:ascii="Consolas" w:hAnsi="Consolas"/>
-                <w:sz w:val="15"/>
-              </w:rPr>
-              <w:t>Program</w:t>
-            </w:r>
-            <w:r>
-              <w:rPr>
-                <w:sz w:val="15"/>
-              </w:rPr>
-              <w:t xml:space="preserve"> puede invocarlo directamente a traves de ese contrato (DIP). Mantener un servicio que solo reenvia la llama</w:t>
-            </w:r>
-            <w:r>
-              <w:rPr>
-                <w:sz w:val="15"/>
-              </w:rPr>
-              <w:t>da no agregaria nada, asi que se elimina la clase completa en vez de transformarla.</w:t>
-            </w:r>
-          </w:p>
-        </w:tc>
-      </w:tr>
-      <w:tr>
-        <w:tc>
-          <w:tcPr>
-            <w:tcW w:w="2062" w:type="dxa"/>
-          </w:tcPr>
-          <w:p>
-            <w:r>
-              <w:rPr>
-                <w:sz w:val="15"/>
-              </w:rPr>
-              <w:t>B-14</w:t>
-            </w:r>
-          </w:p>
-        </w:tc>
-        <w:tc>
-          <w:tcPr>
-            <w:tcW w:w="2062" w:type="dxa"/>
-          </w:tcPr>
-          <w:p>
-            <w:r>
-              <w:rPr>
-                <w:sz w:val="15"/>
-              </w:rPr>
-              <w:t xml:space="preserve">Si </w:t>
-            </w:r>
-            <w:r>
-              <w:rPr>
-                <w:rFonts w:ascii="Consolas" w:hAnsi="Consolas"/>
-                <w:sz w:val="15"/>
-              </w:rPr>
-              <w:t>IDescuento</w:t>
-            </w:r>
-            <w:r>
-              <w:rPr>
-                <w:sz w:val="15"/>
-              </w:rPr>
-              <w:t xml:space="preserve"> / </w:t>
-            </w:r>
-            <w:r>
-              <w:rPr>
-                <w:rFonts w:ascii="Consolas" w:hAnsi="Consolas"/>
-                <w:sz w:val="15"/>
-              </w:rPr>
-              <w:t>ServicioDescuento</w:t>
-            </w:r>
-            <w:r>
-              <w:rPr>
-                <w:sz w:val="15"/>
-              </w:rPr>
-              <w:t xml:space="preserve"> debian marcarse como reemplazados por </w:t>
-            </w:r>
-            <w:r>
-              <w:rPr>
-                <w:rFonts w:ascii="Consolas" w:hAnsi="Consolas"/>
-                <w:sz w:val="15"/>
-              </w:rPr>
-              <w:t>IPoliticaConvenio</w:t>
-            </w:r>
-          </w:p>
-        </w:tc>
-        <w:tc>
-          <w:tcPr>
-            <w:tcW w:w="2062" w:type="dxa"/>
-          </w:tcPr>
-          <w:p>
-            <w:r>
-              <w:rPr>
-                <w:sz w:val="15"/>
-              </w:rPr>
-              <w:t>Una revision externa lo afirmo sin evidencia de codigo</w:t>
-            </w:r>
-          </w:p>
-        </w:tc>
-        <w:tc>
-          <w:tcPr>
-            <w:tcW w:w="2062" w:type="dxa"/>
-          </w:tcPr>
-          <w:p>
-            <w:r>
-              <w:rPr>
-                <w:sz w:val="15"/>
-              </w:rPr>
-              <w:t xml:space="preserve">Rechazamos </w:t>
-            </w:r>
-            <w:r>
-              <w:rPr>
-                <w:sz w:val="15"/>
-              </w:rPr>
-              <w:t>primero, luego aceptamos con evidencia propia</w:t>
-            </w:r>
-          </w:p>
-        </w:tc>
-        <w:tc>
-          <w:tcPr>
-            <w:tcW w:w="2062" w:type="dxa"/>
-          </w:tcPr>
-          <w:p>
-            <w:r>
-              <w:rPr>
-                <w:rFonts w:ascii="Consolas" w:hAnsi="Consolas"/>
-                <w:sz w:val="15"/>
-              </w:rPr>
-              <w:t>CLAUDE.md</w:t>
-            </w:r>
-            <w:r>
-              <w:rPr>
-                <w:sz w:val="15"/>
-              </w:rPr>
-              <w:t xml:space="preserve"> los declara deuda H-08 que no se debe tratar como reemplazada, asi que se rechazo la afirmacion sin verificarla. Al revisar el codigo real del companiero se confirmo que si los elimino. El equipo deci</w:t>
-            </w:r>
-            <w:r>
-              <w:rPr>
-                <w:sz w:val="15"/>
-              </w:rPr>
-              <w:t xml:space="preserve">dio entonces adoptar esa eliminacion como decision propia, no por la sugerencia externa: </w:t>
-            </w:r>
-            <w:r>
-              <w:rPr>
-                <w:rFonts w:ascii="Consolas" w:hAnsi="Consolas"/>
-                <w:sz w:val="15"/>
-              </w:rPr>
-              <w:t>IPoliticaConvenio</w:t>
-            </w:r>
-            <w:r>
-              <w:rPr>
-                <w:sz w:val="15"/>
-              </w:rPr>
-              <w:t xml:space="preserve"> cubre el mismo punto de variacion que ese par dejaba fijo en 10 %, asi que la deuda H-08 queda superada para estas dos clases y CLAUDE.md se actualiz</w:t>
-            </w:r>
-            <w:r>
-              <w:rPr>
-                <w:sz w:val="15"/>
-              </w:rPr>
-              <w:t>o para registrar la excepcion.</w:t>
+              <w:t>SolicitudConvenio solo llevara subtotal, porcentaje y cupo. ResultadoConvenio informara aprobacion, descuento, total, cupo calculado y motivo, sin modificar objetos. ServicioVentaConvenio confirmara stock, movimiento y cupo. Tampoco se crea TipoEntidadConvenio porque ninguna politica usa esa clasificacion.</w:t>
             </w:r>
           </w:p>
         </w:tc>
@@ -4199,9 +3459,6 @@
           </w:tcPr>
           <w:p>
             <w:r>
-              <w:rPr>
-                <w:sz w:val="15"/>
-              </w:rPr>
               <w:t>E-01</w:t>
             </w:r>
           </w:p>
@@ -4212,10 +3469,7 @@
           </w:tcPr>
           <w:p>
             <w:r>
-              <w:rPr>
-                <w:sz w:val="15"/>
-              </w:rPr>
-              <w:t>ServicioVenta.Vender</w:t>
+              <w:t>ServicioProducto</w:t>
             </w:r>
           </w:p>
         </w:tc>
@@ -4225,10 +3479,7 @@
           </w:tcPr>
           <w:p>
             <w:r>
-              <w:rPr>
-                <w:sz w:val="15"/>
-              </w:rPr>
-              <w:t>Transforma</w:t>
+              <w:t>Se transforma</w:t>
             </w:r>
           </w:p>
         </w:tc>
@@ -4238,10 +3489,7 @@
           </w:tcPr>
           <w:p>
             <w:r>
-              <w:rPr>
-                <w:sz w:val="15"/>
-              </w:rPr>
-              <w:t>Sin punto de variacion comercial -&gt; mismo flujo exacto; el convenio va por una ruta aparte</w:t>
+              <w:t>Administraba la coleccion sin ofrecer busqueda -&gt; anade BuscarPorNombre(nombre): primera coincidencia parcial, sin distinguir mayusculas</w:t>
             </w:r>
           </w:p>
         </w:tc>
@@ -4251,10 +3499,7 @@
           </w:tcPr>
           <w:p>
             <w:r>
-              <w:rPr>
-                <w:sz w:val="15"/>
-              </w:rPr>
-              <w:t>Program y los 12 casos siguen igual</w:t>
+              <w:t>Las opciones 3 y 4 de Program y la ruta de convenio buscan por este servicio</w:t>
             </w:r>
           </w:p>
         </w:tc>
@@ -4266,9 +3511,6 @@
           </w:tcPr>
           <w:p>
             <w:r>
-              <w:rPr>
-                <w:sz w:val="15"/>
-              </w:rPr>
               <w:t>E-02</w:t>
             </w:r>
           </w:p>
@@ -4279,10 +3521,7 @@
           </w:tcPr>
           <w:p>
             <w:r>
-              <w:rPr>
-                <w:sz w:val="15"/>
-              </w:rPr>
-              <w:t>IPoliticaConvenio</w:t>
+              <w:t>ServicioVenta</w:t>
             </w:r>
           </w:p>
         </w:tc>
@@ -4292,10 +3531,7 @@
           </w:tcPr>
           <w:p>
             <w:r>
-              <w:rPr>
-                <w:sz w:val="15"/>
-              </w:rPr>
-              <w:t>Entra</w:t>
+              <w:t>Se transforma</w:t>
             </w:r>
           </w:p>
         </w:tc>
@@ -4305,16 +3541,7 @@
           </w:tcPr>
           <w:p>
             <w:r>
-              <w:rPr>
-                <w:sz w:val="15"/>
-              </w:rPr>
-              <w:t>No existia -&gt; contrato Evaluar(SolicitudConvenio): ResultadoConveni</w:t>
-            </w:r>
-            <w:r>
-              <w:rPr>
-                <w:sz w:val="15"/>
-              </w:rPr>
-              <w:t>o</w:t>
+              <w:t>Dependia de ServicioProducto para una segunda busqueda por nombre -&gt; elimina BuscarProducto y esa dependencia; Vender(Producto, int) no cambia</w:t>
             </w:r>
           </w:p>
         </w:tc>
@@ -4324,10 +3551,7 @@
           </w:tcPr>
           <w:p>
             <w:r>
-              <w:rPr>
-                <w:sz w:val="15"/>
-              </w:rPr>
-              <w:t>ServicioVentaConvenio lo consume</w:t>
+              <w:t>Program obtiene el producto con ServicioProducto y lo entrega a Vender</w:t>
             </w:r>
           </w:p>
         </w:tc>
@@ -4339,9 +3563,6 @@
           </w:tcPr>
           <w:p>
             <w:r>
-              <w:rPr>
-                <w:sz w:val="15"/>
-              </w:rPr>
               <w:t>E-03</w:t>
             </w:r>
           </w:p>
@@ -4352,10 +3573,7 @@
           </w:tcPr>
           <w:p>
             <w:r>
-              <w:rPr>
-                <w:sz w:val="15"/>
-              </w:rPr>
-              <w:t>3 politicas concretas</w:t>
+              <w:t>IDescuento</w:t>
             </w:r>
           </w:p>
         </w:tc>
@@ -4365,10 +3583,7 @@
           </w:tcPr>
           <w:p>
             <w:r>
-              <w:rPr>
-                <w:sz w:val="15"/>
-              </w:rPr>
-              <w:t>Entran</w:t>
+              <w:t>Sale</w:t>
             </w:r>
           </w:p>
         </w:tc>
@@ -4378,10 +3593,7 @@
           </w:tcPr>
           <w:p>
             <w:r>
-              <w:rPr>
-                <w:sz w:val="15"/>
-              </w:rPr>
-              <w:t>No existian -&gt; cada una calcula su propio criterio comercial</w:t>
+              <w:t>Definia un calculo que solo recibia un precio -&gt; se elimina, no representa convenio ni credito</w:t>
             </w:r>
           </w:p>
         </w:tc>
@@ -4391,10 +3603,7 @@
           </w:tcPr>
           <w:p>
             <w:r>
-              <w:rPr>
-                <w:sz w:val="15"/>
-              </w:rPr>
-              <w:t>Registradas en el diccionario de Program</w:t>
+              <w:t>Lo reemplaza IPoliticaConvenio; no tenia consumidores</w:t>
             </w:r>
           </w:p>
         </w:tc>
@@ -4406,9 +3615,6 @@
           </w:tcPr>
           <w:p>
             <w:r>
-              <w:rPr>
-                <w:sz w:val="15"/>
-              </w:rPr>
               <w:t>E-04</w:t>
             </w:r>
           </w:p>
@@ -4419,10 +3625,7 @@
           </w:tcPr>
           <w:p>
             <w:r>
-              <w:rPr>
-                <w:sz w:val="15"/>
-              </w:rPr>
-              <w:t>ServicioVentaConvenio</w:t>
+              <w:t>ServicioDescuento</w:t>
             </w:r>
           </w:p>
         </w:tc>
@@ -4432,10 +3635,7 @@
           </w:tcPr>
           <w:p>
             <w:r>
-              <w:rPr>
-                <w:sz w:val="15"/>
-              </w:rPr>
-              <w:t>Entra</w:t>
+              <w:t>Sale</w:t>
             </w:r>
           </w:p>
         </w:tc>
@@ -4445,16 +3645,7 @@
           </w:tcPr>
           <w:p>
             <w:r>
-              <w:rPr>
-                <w:sz w:val="15"/>
-              </w:rPr>
-              <w:t xml:space="preserve">No existia -&gt; arma la solicitud, elige </w:t>
-            </w:r>
-            <w:r>
-              <w:rPr>
-                <w:sz w:val="15"/>
-              </w:rPr>
-              <w:t>politica, aplica el resultado</w:t>
+              <w:t>Aplicaba siempre 10%, sin participar en ServicioVenta -&gt; se elimina para evitar dos modelos comerciales sin integrar</w:t>
             </w:r>
           </w:p>
         </w:tc>
@@ -4464,10 +3655,7 @@
           </w:tcPr>
           <w:p>
             <w:r>
-              <w:rPr>
-                <w:sz w:val="15"/>
-              </w:rPr>
-              <w:t>Program lo construye y expone</w:t>
+              <w:t>No requiere reconexion; las nuevas politicas cubren SC-3</w:t>
             </w:r>
           </w:p>
         </w:tc>
@@ -4479,10 +3667,7 @@
           </w:tcPr>
           <w:p>
             <w:r>
-              <w:rPr>
-                <w:sz w:val="15"/>
-              </w:rPr>
-              <w:t>E-14</w:t>
+              <w:t>E-05</w:t>
             </w:r>
           </w:p>
         </w:tc>
@@ -4492,10 +3677,7 @@
           </w:tcPr>
           <w:p>
             <w:r>
-              <w:rPr>
-                <w:sz w:val="15"/>
-              </w:rPr>
-              <w:t>Convenio</w:t>
+              <w:t>Cliente</w:t>
             </w:r>
           </w:p>
         </w:tc>
@@ -4505,10 +3687,7 @@
           </w:tcPr>
           <w:p>
             <w:r>
-              <w:rPr>
-                <w:sz w:val="15"/>
-              </w:rPr>
-              <w:t>Entra</w:t>
+              <w:t>Se transforma</w:t>
             </w:r>
           </w:p>
         </w:tc>
@@ -4518,10 +3697,7 @@
           </w:tcPr>
           <w:p>
             <w:r>
-              <w:rPr>
-                <w:sz w:val="15"/>
-              </w:rPr>
-              <w:t>No existia -&gt; Entidad, TipoBeneficio, Porcentaje, CupoDisponible</w:t>
+              <w:t>Identificacion, nombre, telefono, correo, puntos -&gt; incorpora cero o un Convenio</w:t>
             </w:r>
           </w:p>
         </w:tc>
@@ -4531,10 +3707,7 @@
           </w:tcPr>
           <w:p>
             <w:r>
-              <w:rPr>
-                <w:sz w:val="15"/>
-              </w:rPr>
-              <w:t>Cliente lo referencia (0..1)</w:t>
+              <w:t>CargadorClientesTxt lo construye; ServicioVentaConvenio consulta su convenio</w:t>
             </w:r>
           </w:p>
         </w:tc>
@@ -4546,10 +3719,7 @@
           </w:tcPr>
           <w:p>
             <w:r>
-              <w:rPr>
-                <w:sz w:val="15"/>
-              </w:rPr>
-              <w:t>E-15</w:t>
+              <w:t>E-06</w:t>
             </w:r>
           </w:p>
         </w:tc>
@@ -4559,10 +3729,7 @@
           </w:tcPr>
           <w:p>
             <w:r>
-              <w:rPr>
-                <w:sz w:val="15"/>
-              </w:rPr>
-              <w:t>TipoBeneficioConvenio</w:t>
+              <w:t>Convenio</w:t>
             </w:r>
           </w:p>
         </w:tc>
@@ -4572,9 +3739,6 @@
           </w:tcPr>
           <w:p>
             <w:r>
-              <w:rPr>
-                <w:sz w:val="15"/>
-              </w:rPr>
               <w:t>Entra</w:t>
             </w:r>
           </w:p>
@@ -4585,16 +3749,7 @@
           </w:tcPr>
           <w:p>
             <w:r>
-              <w:rPr>
-                <w:sz w:val="15"/>
-              </w:rPr>
-              <w:t xml:space="preserve">No existia -&gt; enum SoloDescuento / SoloCredito </w:t>
-            </w:r>
-            <w:r>
-              <w:rPr>
-                <w:sz w:val="15"/>
-              </w:rPr>
-              <w:t>/ DescuentoCredito</w:t>
+              <w:t>No existia -&gt; entidad (texto), tipo de beneficio, porcentaje, cupo disponible</w:t>
             </w:r>
           </w:p>
         </w:tc>
@@ -4604,10 +3759,7 @@
           </w:tcPr>
           <w:p>
             <w:r>
-              <w:rPr>
-                <w:sz w:val="15"/>
-              </w:rPr>
-              <w:t>Llave del diccionario de politicas</w:t>
+              <w:t>Pertenece opcionalmente a Cliente; alimenta SolicitudConvenio</w:t>
             </w:r>
           </w:p>
         </w:tc>
@@ -4619,10 +3771,7 @@
           </w:tcPr>
           <w:p>
             <w:r>
-              <w:rPr>
-                <w:sz w:val="15"/>
-              </w:rPr>
-              <w:t>E-16</w:t>
+              <w:t>E-07</w:t>
             </w:r>
           </w:p>
         </w:tc>
@@ -4632,10 +3781,7 @@
           </w:tcPr>
           <w:p>
             <w:r>
-              <w:rPr>
-                <w:sz w:val="15"/>
-              </w:rPr>
-              <w:t>SolicitudConvenio</w:t>
+              <w:t>TipoBeneficioConvenio</w:t>
             </w:r>
           </w:p>
         </w:tc>
@@ -4645,9 +3791,6 @@
           </w:tcPr>
           <w:p>
             <w:r>
-              <w:rPr>
-                <w:sz w:val="15"/>
-              </w:rPr>
               <w:t>Entra</w:t>
             </w:r>
           </w:p>
@@ -4658,10 +3801,7 @@
           </w:tcPr>
           <w:p>
             <w:r>
-              <w:rPr>
-                <w:sz w:val="15"/>
-              </w:rPr>
-              <w:t>No existia -&gt; solo Subtotal, Porcentaje, CupoDisponible (sin entidades)</w:t>
+              <w:t>No existia -&gt; enum descuento / credito / descuento con credito</w:t>
             </w:r>
           </w:p>
         </w:tc>
@@ -4671,10 +3811,7 @@
           </w:tcPr>
           <w:p>
             <w:r>
-              <w:rPr>
-                <w:sz w:val="15"/>
-              </w:rPr>
-              <w:t>ServicioVentaConvenio la arma</w:t>
+              <w:t>ServicioVentaConvenio lo usa como clave de la estrategia</w:t>
             </w:r>
           </w:p>
         </w:tc>
@@ -4686,10 +3823,7 @@
           </w:tcPr>
           <w:p>
             <w:r>
-              <w:rPr>
-                <w:sz w:val="15"/>
-              </w:rPr>
-              <w:t>E-17</w:t>
+              <w:t>E-08</w:t>
             </w:r>
           </w:p>
         </w:tc>
@@ -4699,10 +3833,7 @@
           </w:tcPr>
           <w:p>
             <w:r>
-              <w:rPr>
-                <w:sz w:val="15"/>
-              </w:rPr>
-              <w:t>ResultadoConvenio</w:t>
+              <w:t>SolicitudConvenio</w:t>
             </w:r>
           </w:p>
         </w:tc>
@@ -4712,9 +3843,6 @@
           </w:tcPr>
           <w:p>
             <w:r>
-              <w:rPr>
-                <w:sz w:val="15"/>
-              </w:rPr>
               <w:t>Entra</w:t>
             </w:r>
           </w:p>
@@ -4725,16 +3853,7 @@
           </w:tcPr>
           <w:p>
             <w:r>
-              <w:rPr>
-                <w:sz w:val="15"/>
-              </w:rPr>
-              <w:t xml:space="preserve">No existia -&gt; Aprobado, </w:t>
-            </w:r>
-            <w:r>
-              <w:rPr>
-                <w:sz w:val="15"/>
-              </w:rPr>
-              <w:t>Descuento, Total, CupoRestante, Motivo</w:t>
+              <w:t>No existia -&gt; subtotal, porcentaje, cupo disponible (inmutable)</w:t>
             </w:r>
           </w:p>
         </w:tc>
@@ -4744,10 +3863,7 @@
           </w:tcPr>
           <w:p>
             <w:r>
-              <w:rPr>
-                <w:sz w:val="15"/>
-              </w:rPr>
-              <w:t>IPoliticaConvenio.Evaluar lo devuelve</w:t>
+              <w:t>La construye ServicioVentaConvenio; sin Cliente/Producto/servicios</w:t>
             </w:r>
           </w:p>
         </w:tc>
@@ -4759,10 +3875,7 @@
           </w:tcPr>
           <w:p>
             <w:r>
-              <w:rPr>
-                <w:sz w:val="15"/>
-              </w:rPr>
-              <w:t>E-18</w:t>
+              <w:t>E-09</w:t>
             </w:r>
           </w:p>
         </w:tc>
@@ -4772,10 +3885,7 @@
           </w:tcPr>
           <w:p>
             <w:r>
-              <w:rPr>
-                <w:sz w:val="15"/>
-              </w:rPr>
-              <w:t>ServicioProducto.BuscarPorNombre</w:t>
+              <w:t>ResultadoConvenio</w:t>
             </w:r>
           </w:p>
         </w:tc>
@@ -4785,10 +3895,7 @@
           </w:tcPr>
           <w:p>
             <w:r>
-              <w:rPr>
-                <w:sz w:val="15"/>
-              </w:rPr>
-              <w:t>Transforma</w:t>
+              <w:t>Entra</w:t>
             </w:r>
           </w:p>
         </w:tc>
@@ -4798,10 +3905,7 @@
           </w:tcPr>
           <w:p>
             <w:r>
-              <w:rPr>
-                <w:sz w:val="15"/>
-              </w:rPr>
-              <w:t>No existia aqui -&gt; metodo nuevo, ya duenio de la lista de productos</w:t>
+              <w:t>No existia -&gt; aprobacion, descuento, total, cupo restante, motivo</w:t>
             </w:r>
           </w:p>
         </w:tc>
@@ -4811,10 +3915,7 @@
           </w:tcPr>
           <w:p>
             <w:r>
-              <w:rPr>
-                <w:sz w:val="15"/>
-              </w:rPr>
-              <w:t>Program lo usa en 3, 4 y en convenios</w:t>
+              <w:t>Lo crea una politica; lo interpreta ServicioVentaConvenio</w:t>
             </w:r>
           </w:p>
         </w:tc>
@@ -4826,10 +3927,7 @@
           </w:tcPr>
           <w:p>
             <w:r>
-              <w:rPr>
-                <w:sz w:val="15"/>
-              </w:rPr>
-              <w:t>E-19</w:t>
+              <w:t>E-10</w:t>
             </w:r>
           </w:p>
         </w:tc>
@@ -4839,16 +3937,7 @@
           </w:tcPr>
           <w:p>
             <w:r>
-              <w:rPr>
-                <w:sz w:val="15"/>
-              </w:rPr>
-              <w:t>ServicioVenta.Bus</w:t>
-            </w:r>
-            <w:r>
-              <w:rPr>
-                <w:sz w:val="15"/>
-              </w:rPr>
-              <w:t>carProducto</w:t>
+              <w:t>IPoliticaConvenio</w:t>
             </w:r>
           </w:p>
         </w:tc>
@@ -4858,10 +3947,7 @@
           </w:tcPr>
           <w:p>
             <w:r>
-              <w:rPr>
-                <w:sz w:val="15"/>
-              </w:rPr>
-              <w:t>Sale</w:t>
+              <w:t>Entra</w:t>
             </w:r>
           </w:p>
         </w:tc>
@@ -4871,10 +3957,7 @@
           </w:tcPr>
           <w:p>
             <w:r>
-              <w:rPr>
-                <w:sz w:val="15"/>
-              </w:rPr>
-              <w:t>Filtraba por nombre -&gt; se traslada intacto a ServicioProducto</w:t>
+              <w:t>No habia punto de variacion comercial -&gt; declara Evaluar(SolicitudConvenio): ResultadoConvenio</w:t>
             </w:r>
           </w:p>
         </w:tc>
@@ -4884,10 +3967,7 @@
           </w:tcPr>
           <w:p>
             <w:r>
-              <w:rPr>
-                <w:sz w:val="15"/>
-              </w:rPr>
-              <w:t>Program llama BuscarPorNombre</w:t>
+              <w:t>ServicioVentaConvenio depende de este contrato</w:t>
             </w:r>
           </w:p>
         </w:tc>
@@ -4899,10 +3979,7 @@
           </w:tcPr>
           <w:p>
             <w:r>
-              <w:rPr>
-                <w:sz w:val="15"/>
-              </w:rPr>
-              <w:t>E-20</w:t>
+              <w:t>E-11</w:t>
             </w:r>
           </w:p>
         </w:tc>
@@ -4912,10 +3989,7 @@
           </w:tcPr>
           <w:p>
             <w:r>
-              <w:rPr>
-                <w:sz w:val="15"/>
-              </w:rPr>
-              <w:t>Cliente</w:t>
+              <w:t>PoliticaSoloDescuento</w:t>
             </w:r>
           </w:p>
         </w:tc>
@@ -4925,10 +3999,7 @@
           </w:tcPr>
           <w:p>
             <w:r>
-              <w:rPr>
-                <w:sz w:val="15"/>
-              </w:rPr>
-              <w:t>Transforma</w:t>
+              <w:t>Entra</w:t>
             </w:r>
           </w:p>
         </w:tc>
@@ -4938,10 +4009,7 @@
           </w:tcPr>
           <w:p>
             <w:r>
-              <w:rPr>
-                <w:sz w:val="15"/>
-              </w:rPr>
-              <w:t>Solo Puntos -&gt; agrega Convenio? por sobrecarga del constructor</w:t>
+              <w:t>No existia -&gt; calcula el descuento, deja intacto el cupo</w:t>
             </w:r>
           </w:p>
         </w:tc>
@@ -4951,10 +4019,7 @@
           </w:tcPr>
           <w:p>
             <w:r>
-              <w:rPr>
-                <w:sz w:val="15"/>
-              </w:rPr>
-              <w:t>Cargadores y servicios sin cambio</w:t>
+              <w:t>Implementa IPoliticaConvenio</w:t>
             </w:r>
           </w:p>
         </w:tc>
@@ -4966,10 +4031,7 @@
           </w:tcPr>
           <w:p>
             <w:r>
-              <w:rPr>
-                <w:sz w:val="15"/>
-              </w:rPr>
-              <w:t>E-21</w:t>
+              <w:t>E-12</w:t>
             </w:r>
           </w:p>
         </w:tc>
@@ -4979,10 +4041,7 @@
           </w:tcPr>
           <w:p>
             <w:r>
-              <w:rPr>
-                <w:sz w:val="15"/>
-              </w:rPr>
-              <w:t>IDescuento</w:t>
+              <w:t>PoliticaSoloCredito</w:t>
             </w:r>
           </w:p>
         </w:tc>
@@ -4992,10 +4051,7 @@
           </w:tcPr>
           <w:p>
             <w:r>
-              <w:rPr>
-                <w:sz w:val="15"/>
-              </w:rPr>
-              <w:t>Sale</w:t>
+              <w:t>Entra</w:t>
             </w:r>
           </w:p>
         </w:tc>
@@ -5005,10 +4061,7 @@
           </w:tcPr>
           <w:p>
             <w:r>
-              <w:rPr>
-                <w:sz w:val="15"/>
-              </w:rPr>
-              <w:t>Contrato de descuento fijo (10%), sin consumidor (H-08) -&gt; superado por IPoliticaConvenio</w:t>
+              <w:t>No existia -&gt; compara subtotal contra cupo, calcula cupo restante</w:t>
             </w:r>
           </w:p>
         </w:tc>
@@ -5018,10 +4071,7 @@
           </w:tcPr>
           <w:p>
             <w:r>
-              <w:rPr>
-                <w:sz w:val="15"/>
-              </w:rPr>
-              <w:t>Nadie lo consumia</w:t>
+              <w:t>Implementa IPoliticaConvenio</w:t>
             </w:r>
           </w:p>
         </w:tc>
@@ -5033,10 +4083,7 @@
           </w:tcPr>
           <w:p>
             <w:r>
-              <w:rPr>
-                <w:sz w:val="15"/>
-              </w:rPr>
-              <w:t>E-22</w:t>
+              <w:t>E-13</w:t>
             </w:r>
           </w:p>
         </w:tc>
@@ -5046,10 +4093,7 @@
           </w:tcPr>
           <w:p>
             <w:r>
-              <w:rPr>
-                <w:sz w:val="15"/>
-              </w:rPr>
-              <w:t>ServicioDescuento</w:t>
+              <w:t>PoliticaDescuentoCredito</w:t>
             </w:r>
           </w:p>
         </w:tc>
@@ -5059,10 +4103,7 @@
           </w:tcPr>
           <w:p>
             <w:r>
-              <w:rPr>
-                <w:sz w:val="15"/>
-              </w:rPr>
-              <w:t>Sale</w:t>
+              <w:t>Entra</w:t>
             </w:r>
           </w:p>
         </w:tc>
@@ -5072,10 +4113,7 @@
           </w:tcPr>
           <w:p>
             <w:r>
-              <w:rPr>
-                <w:sz w:val="15"/>
-              </w:rPr>
-              <w:t>10% fijo, sin consumidor (H-08) -&gt; variacion la resuelve IPoliticaConvenio</w:t>
+              <w:t>No existia -&gt; aplica descuento y evalua el total contra el cupo</w:t>
             </w:r>
           </w:p>
         </w:tc>
@@ -5085,10 +4123,7 @@
           </w:tcPr>
           <w:p>
             <w:r>
-              <w:rPr>
-                <w:sz w:val="15"/>
-              </w:rPr>
-              <w:t>Nadie lo consumia</w:t>
+              <w:t>Implementa IPoliticaConvenio</w:t>
             </w:r>
           </w:p>
         </w:tc>
@@ -5100,10 +4135,7 @@
           </w:tcPr>
           <w:p>
             <w:r>
-              <w:rPr>
-                <w:sz w:val="15"/>
-              </w:rPr>
-              <w:t>E-05</w:t>
+              <w:t>E-14</w:t>
             </w:r>
           </w:p>
         </w:tc>
@@ -5113,10 +4145,7 @@
           </w:tcPr>
           <w:p>
             <w:r>
-              <w:rPr>
-                <w:sz w:val="15"/>
-              </w:rPr>
-              <w:t>ServicioMonitoreoProductos</w:t>
+              <w:t>ServicioVentaConvenio</w:t>
             </w:r>
           </w:p>
         </w:tc>
@@ -5126,10 +4155,7 @@
           </w:tcPr>
           <w:p>
             <w:r>
-              <w:rPr>
-                <w:sz w:val="15"/>
-              </w:rPr>
-              <w:t>Sale</w:t>
+              <w:t>Entra</w:t>
             </w:r>
           </w:p>
         </w:tc>
@@ -5139,10 +4165,7 @@
           </w:tcPr>
           <w:p>
             <w:r>
-              <w:rPr>
-                <w:sz w:val="15"/>
-              </w:rPr>
-              <w:t>2 metodos + 2 eventos propios -&gt; clase completa eliminada</w:t>
+              <w:t>Solo existia la venta normal -&gt; selecciona politica, evalua, confirma stock/movimiento/cupo si se aprueba</w:t>
             </w:r>
           </w:p>
         </w:tc>
@@ -5152,10 +4175,7 @@
           </w:tcPr>
           <w:p>
             <w:r>
-              <w:rPr>
-                <w:sz w:val="15"/>
-              </w:rPr>
-              <w:t>Program usa MonitorCompuesto via IReglaAlerta</w:t>
+              <w:t>Recibe el registro de estrategias y ServicioMovimiento</w:t>
             </w:r>
           </w:p>
         </w:tc>
@@ -5167,10 +4187,7 @@
           </w:tcPr>
           <w:p>
             <w:r>
-              <w:rPr>
-                <w:sz w:val="15"/>
-              </w:rPr>
-              <w:t>E-06</w:t>
+              <w:t>E-15</w:t>
             </w:r>
           </w:p>
         </w:tc>
@@ -5180,10 +4197,7 @@
           </w:tcPr>
           <w:p>
             <w:r>
-              <w:rPr>
-                <w:sz w:val="15"/>
-              </w:rPr>
-              <w:t>IReglaAlerta</w:t>
+              <w:t>clientes.txt</w:t>
             </w:r>
           </w:p>
         </w:tc>
@@ -5193,10 +4207,7 @@
           </w:tcPr>
           <w:p>
             <w:r>
-              <w:rPr>
-                <w:sz w:val="15"/>
-              </w:rPr>
-              <w:t>Entra</w:t>
+              <w:t>Se transforma</w:t>
             </w:r>
           </w:p>
         </w:tc>
@@ -5206,10 +4217,7 @@
           </w:tcPr>
           <w:p>
             <w:r>
-              <w:rPr>
-                <w:sz w:val="15"/>
-              </w:rPr>
-              <w:t>No existia -&gt; Verificar(IEnumerable&lt;Producto&gt;): void</w:t>
+              <w:t>4 campos basicos por fila -&gt; admite, opcionalmente, entidad/beneficio/porcentaje/cupo</w:t>
             </w:r>
           </w:p>
         </w:tc>
@@ -5219,10 +4227,7 @@
           </w:tcPr>
           <w:p>
             <w:r>
-              <w:rPr>
-                <w:sz w:val="15"/>
-              </w:rPr>
-              <w:t>Hojas y compuesto lo implementan</w:t>
+              <w:t>CargadorClientesTxt sigue leyendolo, con o sin convenio</w:t>
             </w:r>
           </w:p>
         </w:tc>
@@ -5234,10 +4239,7 @@
           </w:tcPr>
           <w:p>
             <w:r>
-              <w:rPr>
-                <w:sz w:val="15"/>
-              </w:rPr>
-              <w:t>E-07</w:t>
+              <w:t>E-16</w:t>
             </w:r>
           </w:p>
         </w:tc>
@@ -5247,10 +4249,7 @@
           </w:tcPr>
           <w:p>
             <w:r>
-              <w:rPr>
-                <w:sz w:val="15"/>
-              </w:rPr>
-              <w:t>ReglaStockMinimo / ReglaVencimiento</w:t>
+              <w:t>ServicioMonitoreoProductos</w:t>
             </w:r>
           </w:p>
         </w:tc>
@@ -5260,10 +4259,7 @@
           </w:tcPr>
           <w:p>
             <w:r>
-              <w:rPr>
-                <w:sz w:val="15"/>
-              </w:rPr>
-              <w:t>Entran</w:t>
+              <w:t>Sale</w:t>
             </w:r>
           </w:p>
         </w:tc>
@@ -5273,10 +4269,7 @@
           </w:tcPr>
           <w:p>
             <w:r>
-              <w:rPr>
-                <w:sz w:val="15"/>
-              </w:rPr>
-              <w:t>Eran metodos del monitor -&gt; hojas independientes</w:t>
+              <w:t>Verificaciones de stock y vencimiento directas, conocia los 2 eventos -&gt; se elimina; reglas pasan a hojas independientes</w:t>
             </w:r>
           </w:p>
         </w:tc>
@@ -5286,10 +4279,7 @@
           </w:tcPr>
           <w:p>
             <w:r>
-              <w:rPr>
-                <w:sz w:val="15"/>
-              </w:rPr>
-              <w:t>MonitorCompuesto las compone</w:t>
+              <w:t>Program deja de construirlo, usa MonitorCompuesto</w:t>
             </w:r>
           </w:p>
         </w:tc>
@@ -5301,10 +4291,7 @@
           </w:tcPr>
           <w:p>
             <w:r>
-              <w:rPr>
-                <w:sz w:val="15"/>
-              </w:rPr>
-              <w:t>E-08</w:t>
+              <w:t>E-17</w:t>
             </w:r>
           </w:p>
         </w:tc>
@@ -5314,10 +4301,7 @@
           </w:tcPr>
           <w:p>
             <w:r>
-              <w:rPr>
-                <w:sz w:val="15"/>
-              </w:rPr>
-              <w:t>MonitorCompuesto</w:t>
+              <w:t>IReglaAlerta</w:t>
             </w:r>
           </w:p>
         </w:tc>
@@ -5327,9 +4311,6 @@
           </w:tcPr>
           <w:p>
             <w:r>
-              <w:rPr>
-                <w:sz w:val="15"/>
-              </w:rPr>
               <w:t>Entra</w:t>
             </w:r>
           </w:p>
@@ -5340,10 +4321,7 @@
           </w:tcPr>
           <w:p>
             <w:r>
-              <w:rPr>
-                <w:sz w:val="15"/>
-              </w:rPr>
-              <w:t>No existia -&gt; implementa y compone IReglaAlerta, ejecuta en orden de alta</w:t>
+              <w:t>No existia contrato comun -&gt; declara Verificar(IEnumerable&lt;Producto&gt;): void</w:t>
             </w:r>
           </w:p>
         </w:tc>
@@ -5353,10 +4331,7 @@
           </w:tcPr>
           <w:p>
             <w:r>
-              <w:rPr>
-                <w:sz w:val="15"/>
-              </w:rPr>
-              <w:t>Program lo arma y lo invoca</w:t>
+              <w:t>Lo implementan las 2 hojas y MonitorCompuesto</w:t>
             </w:r>
           </w:p>
         </w:tc>
@@ -5368,16 +4343,7 @@
           </w:tcPr>
           <w:p>
             <w:r>
-              <w:rPr>
-                <w:sz w:val="15"/>
-              </w:rPr>
-              <w:t>E-0</w:t>
-            </w:r>
-            <w:r>
-              <w:rPr>
-                <w:sz w:val="15"/>
-              </w:rPr>
-              <w:t>9</w:t>
+              <w:t>E-18</w:t>
             </w:r>
           </w:p>
         </w:tc>
@@ -5387,10 +4353,7 @@
           </w:tcPr>
           <w:p>
             <w:r>
-              <w:rPr>
-                <w:sz w:val="15"/>
-              </w:rPr>
-              <w:t>CargadorProductosTxt</w:t>
+              <w:t>ReglaStockMinimo</w:t>
             </w:r>
           </w:p>
         </w:tc>
@@ -5400,10 +4363,7 @@
           </w:tcPr>
           <w:p>
             <w:r>
-              <w:rPr>
-                <w:sz w:val="15"/>
-              </w:rPr>
-              <w:t>Transforma</w:t>
+              <w:t>Entra</w:t>
             </w:r>
           </w:p>
         </w:tc>
@@ -5413,10 +4373,7 @@
           </w:tcPr>
           <w:p>
             <w:r>
-              <w:rPr>
-                <w:sz w:val="15"/>
-              </w:rPr>
-              <w:t>Flujo completo repetido -&gt; hereda CargadorTxt, solo ParsearCampos</w:t>
+              <w:t>Logica en ServicioMonitoreoProductos.VerificarStock -&gt; hoja que conserva criterio, evento y texto</w:t>
             </w:r>
           </w:p>
         </w:tc>
@@ -5426,10 +4383,7 @@
           </w:tcPr>
           <w:p>
             <w:r>
-              <w:rPr>
-                <w:sz w:val="15"/>
-              </w:rPr>
-              <w:t>ICargadorProductos y Program sin cambio</w:t>
+              <w:t>Program conecta su evento, la agrega primero</w:t>
             </w:r>
           </w:p>
         </w:tc>
@@ -5441,10 +4395,7 @@
           </w:tcPr>
           <w:p>
             <w:r>
-              <w:rPr>
-                <w:sz w:val="15"/>
-              </w:rPr>
-              <w:t>E-10</w:t>
+              <w:t>E-19</w:t>
             </w:r>
           </w:p>
         </w:tc>
@@ -5454,10 +4405,7 @@
           </w:tcPr>
           <w:p>
             <w:r>
-              <w:rPr>
-                <w:sz w:val="15"/>
-              </w:rPr>
-              <w:t>CargadorClientesTxt</w:t>
+              <w:t>ReglaVencimiento</w:t>
             </w:r>
           </w:p>
         </w:tc>
@@ -5467,10 +4415,7 @@
           </w:tcPr>
           <w:p>
             <w:r>
-              <w:rPr>
-                <w:sz w:val="15"/>
-              </w:rPr>
-              <w:t>Transforma</w:t>
+              <w:t>Entra</w:t>
             </w:r>
           </w:p>
         </w:tc>
@@ -5480,10 +4425,7 @@
           </w:tcPr>
           <w:p>
             <w:r>
-              <w:rPr>
-                <w:sz w:val="15"/>
-              </w:rPr>
-              <w:t>Idem -&gt; hereda, solo ParsearCampos de Cliente</w:t>
+              <w:t>Logica en ServicioMonitoreoProductos.VerificarVencimiento -&gt; hoja que conserva criterio, evento y texto</w:t>
             </w:r>
           </w:p>
         </w:tc>
@@ -5493,10 +4435,7 @@
           </w:tcPr>
           <w:p>
             <w:r>
-              <w:rPr>
-                <w:sz w:val="15"/>
-              </w:rPr>
-              <w:t>ICargadorClientes sin cambio</w:t>
+              <w:t>Program conecta su evento, la agrega despues</w:t>
             </w:r>
           </w:p>
         </w:tc>
@@ -5508,10 +4447,7 @@
           </w:tcPr>
           <w:p>
             <w:r>
-              <w:rPr>
-                <w:sz w:val="15"/>
-              </w:rPr>
-              <w:t>E-11</w:t>
+              <w:t>E-20</w:t>
             </w:r>
           </w:p>
         </w:tc>
@@ -5521,10 +4457,7 @@
           </w:tcPr>
           <w:p>
             <w:r>
-              <w:rPr>
-                <w:sz w:val="15"/>
-              </w:rPr>
-              <w:t>CargadorUsuariosTxt</w:t>
+              <w:t>MonitorCompuesto</w:t>
             </w:r>
           </w:p>
         </w:tc>
@@ -5534,10 +4467,7 @@
           </w:tcPr>
           <w:p>
             <w:r>
-              <w:rPr>
-                <w:sz w:val="15"/>
-              </w:rPr>
-              <w:t>Transforma</w:t>
+              <w:t>Entra</w:t>
             </w:r>
           </w:p>
         </w:tc>
@@ -5547,10 +4477,7 @@
           </w:tcPr>
           <w:p>
             <w:r>
-              <w:rPr>
-                <w:sz w:val="15"/>
-              </w:rPr>
-              <w:t>Idem -&gt; hereda, solo ParsearCampos de Usuario</w:t>
+              <w:t>No existia -&gt; implementa IReglaAlerta, coleccion ordenada, ejecuta todas</w:t>
             </w:r>
           </w:p>
         </w:tc>
@@ -5560,10 +4487,7 @@
           </w:tcPr>
           <w:p>
             <w:r>
-              <w:rPr>
-                <w:sz w:val="15"/>
-              </w:rPr>
-              <w:t>ICargadorUsuarios sin cambio</w:t>
+              <w:t>Program construye hojas y grupo; lo invoca como IReglaAlerta</w:t>
             </w:r>
           </w:p>
         </w:tc>
@@ -5575,10 +4499,7 @@
           </w:tcPr>
           <w:p>
             <w:r>
-              <w:rPr>
-                <w:sz w:val="15"/>
-              </w:rPr>
-              <w:t>E-12</w:t>
+              <w:t>E-21</w:t>
             </w:r>
           </w:p>
         </w:tc>
@@ -5588,9 +4509,6 @@
           </w:tcPr>
           <w:p>
             <w:r>
-              <w:rPr>
-                <w:sz w:val="15"/>
-              </w:rPr>
               <w:t>CargadorTxt&lt;T&gt;</w:t>
             </w:r>
           </w:p>
@@ -5601,9 +4519,6 @@
           </w:tcPr>
           <w:p>
             <w:r>
-              <w:rPr>
-                <w:sz w:val="15"/>
-              </w:rPr>
               <w:t>Entra</w:t>
             </w:r>
           </w:p>
@@ -5614,10 +4529,7 @@
           </w:tcPr>
           <w:p>
             <w:r>
-              <w:rPr>
-                <w:sz w:val="15"/>
-              </w:rPr>
-              <w:t>No existia -&gt; algoritmo comun: validar, leer, Split(;), agregar, error</w:t>
+              <w:t>Algoritmo comun repetido en 3 cargadores -&gt; controla validacion, lectura, Split, parseo delegado, agregado, error, mensaje</w:t>
             </w:r>
           </w:p>
         </w:tc>
@@ -5627,10 +4539,7 @@
           </w:tcPr>
           <w:p>
             <w:r>
-              <w:rPr>
-                <w:sz w:val="15"/>
-              </w:rPr>
-              <w:t>Los 3 cargadores heredan de ella</w:t>
+              <w:t>Base de los 3 cargadores; Program no la conoce directamente</w:t>
             </w:r>
           </w:p>
         </w:tc>
@@ -5642,10 +4551,7 @@
           </w:tcPr>
           <w:p>
             <w:r>
-              <w:rPr>
-                <w:sz w:val="15"/>
-              </w:rPr>
-              <w:t>E-13</w:t>
+              <w:t>E-22</w:t>
             </w:r>
           </w:p>
         </w:tc>
@@ -5655,10 +4561,7 @@
           </w:tcPr>
           <w:p>
             <w:r>
-              <w:rPr>
-                <w:sz w:val="15"/>
-              </w:rPr>
-              <w:t>ICreadorProducto + SelectorCreadorProducto</w:t>
+              <w:t>CargadorProductosTxt</w:t>
             </w:r>
           </w:p>
         </w:tc>
@@ -5668,10 +4571,7 @@
           </w:tcPr>
           <w:p>
             <w:r>
-              <w:rPr>
-                <w:sz w:val="15"/>
-              </w:rPr>
-              <w:t>Se conserva</w:t>
+              <w:t>Se transforma</w:t>
             </w:r>
           </w:p>
         </w:tc>
@@ -5681,10 +4581,7 @@
           </w:tcPr>
           <w:p>
             <w:r>
-              <w:rPr>
-                <w:sz w:val="15"/>
-              </w:rPr>
-              <w:t>Ya era el mecanismo unico de creacion desde Reto 1</w:t>
+              <w:t>Ejecutaba el algoritmo completo y el parseo -&gt; hereda CargadorTxt&lt;Producto&gt;, implementa ParsearCampos</w:t>
             </w:r>
           </w:p>
         </w:tc>
@@ -5694,10 +4591,163 @@
           </w:tcPr>
           <w:p>
             <w:r>
-              <w:rPr>
-                <w:sz w:val="15"/>
-              </w:rPr>
-              <w:t>Sin cambio; ningun consumidor se rompe</w:t>
+              <w:t>Mantiene ICargadorProductos; ServicioProducto sin cambio</w:t>
+            </w:r>
+          </w:p>
+        </w:tc>
+      </w:tr>
+      <w:tr>
+        <w:tc>
+          <w:tcPr>
+            <w:tcW w:type="dxa" w:w="2828"/>
+          </w:tcPr>
+          <w:p>
+            <w:r>
+              <w:t>E-23</w:t>
+            </w:r>
+          </w:p>
+        </w:tc>
+        <w:tc>
+          <w:tcPr>
+            <w:tcW w:type="dxa" w:w="2828"/>
+          </w:tcPr>
+          <w:p>
+            <w:r>
+              <w:t>CargadorClientesTxt</w:t>
+            </w:r>
+          </w:p>
+        </w:tc>
+        <w:tc>
+          <w:tcPr>
+            <w:tcW w:type="dxa" w:w="2828"/>
+          </w:tcPr>
+          <w:p>
+            <w:r>
+              <w:t>Se transforma</w:t>
+            </w:r>
+          </w:p>
+        </w:tc>
+        <w:tc>
+          <w:tcPr>
+            <w:tcW w:type="dxa" w:w="2828"/>
+          </w:tcPr>
+          <w:p>
+            <w:r>
+              <w:t>Ejecutaba el algoritmo completo, leia 4 campos -&gt; hereda CargadorTxt&lt;Cliente&gt;, implementa ParsearCampos y crea convenio opcional</w:t>
+            </w:r>
+          </w:p>
+        </w:tc>
+        <w:tc>
+          <w:tcPr>
+            <w:tcW w:type="dxa" w:w="2828"/>
+          </w:tcPr>
+          <w:p>
+            <w:r>
+              <w:t>Mantiene ICargadorClientes; ServicioCliente sin cambio</w:t>
+            </w:r>
+          </w:p>
+        </w:tc>
+      </w:tr>
+      <w:tr>
+        <w:tc>
+          <w:tcPr>
+            <w:tcW w:type="dxa" w:w="2828"/>
+          </w:tcPr>
+          <w:p>
+            <w:r>
+              <w:t>E-24</w:t>
+            </w:r>
+          </w:p>
+        </w:tc>
+        <w:tc>
+          <w:tcPr>
+            <w:tcW w:type="dxa" w:w="2828"/>
+          </w:tcPr>
+          <w:p>
+            <w:r>
+              <w:t>CargadorUsuariosTxt</w:t>
+            </w:r>
+          </w:p>
+        </w:tc>
+        <w:tc>
+          <w:tcPr>
+            <w:tcW w:type="dxa" w:w="2828"/>
+          </w:tcPr>
+          <w:p>
+            <w:r>
+              <w:t>Se transforma</w:t>
+            </w:r>
+          </w:p>
+        </w:tc>
+        <w:tc>
+          <w:tcPr>
+            <w:tcW w:type="dxa" w:w="2828"/>
+          </w:tcPr>
+          <w:p>
+            <w:r>
+              <w:t>Ejecutaba el algoritmo completo y el parseo -&gt; hereda CargadorTxt&lt;Usuario&gt;, implementa ParsearCampos</w:t>
+            </w:r>
+          </w:p>
+        </w:tc>
+        <w:tc>
+          <w:tcPr>
+            <w:tcW w:type="dxa" w:w="2828"/>
+          </w:tcPr>
+          <w:p>
+            <w:r>
+              <w:t>Mantiene ICargadorUsuarios; ServicioUsuario sin cambio</w:t>
+            </w:r>
+          </w:p>
+        </w:tc>
+      </w:tr>
+      <w:tr>
+        <w:tc>
+          <w:tcPr>
+            <w:tcW w:type="dxa" w:w="2828"/>
+          </w:tcPr>
+          <w:p>
+            <w:r>
+              <w:t>E-25</w:t>
+            </w:r>
+          </w:p>
+        </w:tc>
+        <w:tc>
+          <w:tcPr>
+            <w:tcW w:type="dxa" w:w="2828"/>
+          </w:tcPr>
+          <w:p>
+            <w:r>
+              <w:t>Program</w:t>
+            </w:r>
+          </w:p>
+        </w:tc>
+        <w:tc>
+          <w:tcPr>
+            <w:tcW w:type="dxa" w:w="2828"/>
+          </w:tcPr>
+          <w:p>
+            <w:r>
+              <w:t>Se transforma</w:t>
+            </w:r>
+          </w:p>
+        </w:tc>
+        <w:tc>
+          <w:tcPr>
+            <w:tcW w:type="dxa" w:w="2828"/>
+          </w:tcPr>
+          <w:p>
+            <w:r>
+              <w:t>Buscaba directo en la opcion 3, delegaba otra busqueda a ServicioVenta, construia el monitor anterior, sin SC-3 -&gt; usa BuscarPorNombre en consulta y venta, registra estrategias, construye el Composite, reconoce --convenio</w:t>
+            </w:r>
+          </w:p>
+        </w:tc>
+        <w:tc>
+          <w:tcPr>
+            <w:tcW w:type="dxa" w:w="2828"/>
+          </w:tcPr>
+          <w:p>
+            <w:r>
+              <w:t>Sin --convenio conserva menu y salidas; con --convenio coordina la nueva venta</w:t>
             </w:r>
           </w:p>
         </w:tc>
@@ -5711,33 +4761,7 @@
         <w:rPr>
           <w:sz w:val="16"/>
         </w:rPr>
-        <w:t>Se eliminan 4 elementos: ServicioVenta.BuscarProducto (E-19, su lógica se traslada intacta), ServicioMonitoreo</w:t>
-      </w:r>
-      <w:r>
-        <w:rPr>
-          <w:sz w:val="16"/>
-        </w:rPr>
-        <w:t xml:space="preserve">Productos (E-05, sin rol una vez que Program usa MonitorCompuesto vía IReglaAlerta) e IDescuento/ServicioDescuento (E-21, E-22, deuda H-08 superada por IPoliticaConvenio). Ninguna cambia la salida observable. Detalle completo por fila en </w:t>
-      </w:r>
-      <w:r>
-        <w:rPr>
-          <w:rFonts w:ascii="Consolas" w:hAnsi="Consolas"/>
-          <w:sz w:val="16"/>
-        </w:rPr>
-        <w:t>Tabla_Cambio_Estru</w:t>
-      </w:r>
-      <w:r>
-        <w:rPr>
-          <w:rFonts w:ascii="Consolas" w:hAnsi="Consolas"/>
-          <w:sz w:val="16"/>
-        </w:rPr>
-        <w:t>ctural.md</w:t>
-      </w:r>
-      <w:r>
-        <w:rPr>
-          <w:sz w:val="16"/>
-        </w:rPr>
-        <w:t>.</w:t>
+        <w:t>Se eliminan 4 elementos: ServicioVenta pierde BuscarProducto (E-02, la busqueda se traslada a ServicioProducto), ServicioMonitoreoProductos (E-16, sin rol una vez que Program usa MonitorCompuesto via IReglaAlerta) e IDescuento/ServicioDescuento (E-03, E-04, deuda H-08 superada por IPoliticaConvenio). Ninguna cambia la salida observable. Detalle completo por fila en Tabla_Cambio_Estructural.md.</w:t>
       </w:r>
     </w:p>
     <w:p>
@@ -9147,86 +8171,6 @@
           </w:p>
         </w:tc>
       </w:tr>
-      <w:tr>
-        <w:tc>
-          <w:tcPr>
-            <w:tcW w:w="1757" w:type="dxa"/>
-          </w:tcPr>
-          <w:p>
-            <w:r>
-              <w:rPr>
-                <w:sz w:val="16"/>
-              </w:rPr>
-              <w:t>Factory Method (consolidacion)</w:t>
-            </w:r>
-          </w:p>
-        </w:tc>
-        <w:tc>
-          <w:tcPr>
-            <w:tcW w:w="1757" w:type="dxa"/>
-          </w:tcPr>
-          <w:p>
-            <w:r>
-              <w:rPr>
-                <w:sz w:val="16"/>
-              </w:rPr>
-              <w:t>Neutro</w:t>
-            </w:r>
-          </w:p>
-        </w:tc>
-        <w:tc>
-          <w:tcPr>
-            <w:tcW w:w="1757" w:type="dxa"/>
-          </w:tcPr>
-          <w:p>
-            <w:r>
-              <w:rPr>
-                <w:sz w:val="16"/>
-              </w:rPr>
-              <w:t>Refuerza</w:t>
-            </w:r>
-          </w:p>
-        </w:tc>
-        <w:tc>
-          <w:tcPr>
-            <w:tcW w:w="1757" w:type="dxa"/>
-          </w:tcPr>
-          <w:p>
-            <w:r>
-              <w:rPr>
-                <w:sz w:val="16"/>
-              </w:rPr>
-              <w:t>Neutro</w:t>
-            </w:r>
-          </w:p>
-        </w:tc>
-        <w:tc>
-          <w:tcPr>
-            <w:tcW w:w="1757" w:type="dxa"/>
-          </w:tcPr>
-          <w:p>
-            <w:r>
-              <w:rPr>
-                <w:sz w:val="16"/>
-              </w:rPr>
-              <w:t>Neutro</w:t>
-            </w:r>
-          </w:p>
-        </w:tc>
-        <w:tc>
-          <w:tcPr>
-            <w:tcW w:w="1757" w:type="dxa"/>
-          </w:tcPr>
-          <w:p>
-            <w:r>
-              <w:rPr>
-                <w:sz w:val="16"/>
-              </w:rPr>
-              <w:t>Refuerza</w:t>
-            </w:r>
-          </w:p>
-        </w:tc>
-      </w:tr>
     </w:tbl>
     <w:p>
       <w:pPr>
@@ -9393,36 +8337,6 @@
           <w:sz w:val="16"/>
         </w:rPr>
         <w:t>opcionales.</w:t>
-      </w:r>
-    </w:p>
-    <w:p>
-      <w:pPr>
-        <w:pStyle w:val="Listaconvietas"/>
-        <w:spacing w:after="20" w:line="240" w:lineRule="auto"/>
-      </w:pPr>
-      <w:r>
-        <w:rPr>
-          <w:sz w:val="16"/>
-        </w:rPr>
-        <w:t>Factory Method / OCP (Refuerza): un tipo de producto nuevo es un creador + un registro en el diccionario; CargadorProductosTxt no se modifica.</w:t>
-      </w:r>
-    </w:p>
-    <w:p>
-      <w:pPr>
-        <w:pStyle w:val="Listaconvietas"/>
-        <w:spacing w:after="20" w:line="240" w:lineRule="auto"/>
-      </w:pPr>
-      <w:r>
-        <w:rPr>
-          <w:sz w:val="16"/>
-        </w:rPr>
-        <w:t>Factory Method / DIP (Refuerza): CargadorProductosTxt depende de ISelectorCreadorProducto / ICreadorP</w:t>
-      </w:r>
-      <w:r>
-        <w:rPr>
-          <w:sz w:val="16"/>
-        </w:rPr>
-        <w:t>roducto, no de creadores concretos.</w:t>
       </w:r>
     </w:p>
     <w:p>
@@ -9735,32 +8649,7 @@
         <w:rPr>
           <w:sz w:val="17"/>
         </w:rPr>
-        <w:t xml:space="preserve">12 casos heredados del Reto 1, corridos contra el TO-BE </w:t>
-      </w:r>
-      <w:r>
-        <w:rPr>
-          <w:sz w:val="17"/>
-        </w:rPr>
-        <w:t>Reto 1 (</w:t>
-      </w:r>
-      <w:r>
-        <w:rPr>
-          <w:rFonts w:ascii="Consolas" w:hAnsi="Consolas"/>
-          <w:sz w:val="17"/>
-        </w:rPr>
-        <w:t>03-src</w:t>
-      </w:r>
-      <w:r>
-        <w:rPr>
-          <w:sz w:val="17"/>
-        </w:rPr>
-        <w:t>) y contra el código real del Reto 2, comparados byte a byte, más 4 casos nuevos que ejercitan Strategy, el único patrón que agrega comportamiento observable (Composite, Template Method y Factory Method se adoptaron para que la salida no camb</w:t>
-      </w:r>
-      <w:r>
-        <w:rPr>
-          <w:sz w:val="17"/>
-        </w:rPr>
-        <w:t>iara, y la prueba de eso son los 12 casos heredados, no un camino nuevo).</w:t>
+        <w:t>12 casos heredados del Reto 1, corridos contra el TO-BE Reto 1 (03-src) y contra el codigo real del Reto 2 (con los tres patrones adoptados: Strategy, Composite y Template Method), comparados byte a byte, mas 4 casos nuevos que ejercitan Strategy, el unico patron que agrega comportamiento observable. Composite y Template Method se adoptaron para que la salida no cambiara, y la prueba de eso son los 12 casos heredados, no un camino nuevo. Factory Method no es un patron incorporado en este reto: sigue igual que en el Reto 1.</w:t>
       </w:r>
     </w:p>
     <w:tbl>
@@ -14040,139 +12929,7 @@
           <w:b/>
           <w:sz w:val="15"/>
         </w:rPr>
-        <w:t xml:space="preserve">El formato del archivo de productos sigue acoplado por </w:t>
-      </w:r>
-      <w:r>
-        <w:rPr>
-          <w:b/>
-          <w:sz w:val="15"/>
-        </w:rPr>
-        <w:t>posición</w:t>
-      </w:r>
-    </w:p>
-    <w:p>
-      <w:pPr>
-        <w:spacing w:before="20" w:after="60" w:line="240" w:lineRule="auto"/>
-        <w:jc w:val="both"/>
-      </w:pPr>
-      <w:r>
-        <w:rPr>
-          <w:sz w:val="15"/>
-        </w:rPr>
-        <w:t>(</w:t>
-      </w:r>
-      <w:r>
-        <w:rPr>
-          <w:rFonts w:ascii="Consolas" w:hAnsi="Consolas"/>
-          <w:sz w:val="15"/>
-        </w:rPr>
-        <w:t>datos[0]</w:t>
-      </w:r>
-      <w:r>
-        <w:rPr>
-          <w:sz w:val="15"/>
-        </w:rPr>
-        <w:t xml:space="preserve"> es el tipo, </w:t>
-      </w:r>
-      <w:r>
-        <w:rPr>
-          <w:rFonts w:ascii="Consolas" w:hAnsi="Consolas"/>
-          <w:sz w:val="15"/>
-        </w:rPr>
-        <w:t>datos[1]</w:t>
-      </w:r>
-      <w:r>
-        <w:rPr>
-          <w:sz w:val="15"/>
-        </w:rPr>
-        <w:t xml:space="preserve"> el nombre, etc.). Consolidar Factory</w:t>
-      </w:r>
-    </w:p>
-    <w:p>
-      <w:pPr>
-        <w:spacing w:before="20" w:after="60" w:line="240" w:lineRule="auto"/>
-        <w:jc w:val="both"/>
-      </w:pPr>
-      <w:r>
-        <w:rPr>
-          <w:sz w:val="15"/>
-        </w:rPr>
-        <w:t xml:space="preserve">Method no resolvió eso: cada creador sigue leyendo </w:t>
-      </w:r>
-      <w:r>
-        <w:rPr>
-          <w:rFonts w:ascii="Consolas" w:hAnsi="Consolas"/>
-          <w:sz w:val="15"/>
-        </w:rPr>
-        <w:t>Extra[i]</w:t>
-      </w:r>
-      <w:r>
-        <w:rPr>
-          <w:sz w:val="15"/>
-        </w:rPr>
-        <w:t xml:space="preserve"> por índice.</w:t>
-      </w:r>
-    </w:p>
-    <w:p>
-      <w:pPr>
-        <w:spacing w:before="20" w:after="60" w:line="240" w:lineRule="auto"/>
-        <w:jc w:val="both"/>
-      </w:pPr>
-      <w:r>
-        <w:rPr>
-          <w:sz w:val="15"/>
-        </w:rPr>
-        <w:t>Agregar una columna nueva al inventario sigue costando tocar</w:t>
-      </w:r>
-    </w:p>
-    <w:p>
-      <w:pPr>
-        <w:spacing w:before="20" w:after="60" w:line="240" w:lineRule="auto"/>
-        <w:jc w:val="both"/>
-      </w:pPr>
-      <w:r>
-        <w:rPr>
-          <w:rFonts w:ascii="Consolas" w:hAnsi="Consolas"/>
-          <w:sz w:val="15"/>
-        </w:rPr>
-        <w:t>DatosProducto</w:t>
-      </w:r>
-      <w:r>
-        <w:rPr>
-          <w:sz w:val="15"/>
-        </w:rPr>
-        <w:t xml:space="preserve">, </w:t>
-      </w:r>
-      <w:r>
-        <w:rPr>
-          <w:rFonts w:ascii="Consolas" w:hAnsi="Consolas"/>
-          <w:sz w:val="15"/>
-        </w:rPr>
-        <w:t>CargadorProductosTxt</w:t>
-      </w:r>
-      <w:r>
-        <w:rPr>
-          <w:sz w:val="15"/>
-        </w:rPr>
-        <w:t xml:space="preserve"> y cada cre</w:t>
-      </w:r>
-      <w:r>
-        <w:rPr>
-          <w:sz w:val="15"/>
-        </w:rPr>
-        <w:t>ador (P-01 sigue</w:t>
-      </w:r>
-    </w:p>
-    <w:p>
-      <w:pPr>
-        <w:spacing w:before="20" w:after="60" w:line="240" w:lineRule="auto"/>
-        <w:jc w:val="both"/>
-      </w:pPr>
-      <w:r>
-        <w:rPr>
-          <w:sz w:val="15"/>
-        </w:rPr>
-        <w:t>abierto).</w:t>
+        <w:t>El formato del archivo de productos sigue acoplado por posicion (datos[0] es el tipo, datos[1] el nombre, etc.). Ningun patron de este reto atiende esto: Factory Method sigue leyendo Extra[i] por indice en cada creador, igual que en el Reto 1. Agregar una columna nueva al inventario sigue costando tocar DatosProducto, CargadorProductosTxt y cada creador: 3 archivos / 3 clases. Es deuda declarada, no un punto de dolor con ID propio en esta entrega (no confundir con P-01, que ahora es la busqueda de productos duplicada y ya quedo resuelta).</w:t>
       </w:r>
     </w:p>
     <w:p>

</xml_diff>